<commit_message>
add redis into project and implements service spec and new controller
</commit_message>
<xml_diff>
--- a/CareSync_Specifications.docx
+++ b/CareSync_Specifications.docx
@@ -157,14 +157,14 @@
         </w:tblCellMar>
       </w:tblPr>
       <w:tblGrid>
-        <w:gridCol w:w="2799"/>
-        <w:gridCol w:w="6226"/>
+        <w:gridCol w:w="2798"/>
+        <w:gridCol w:w="6227"/>
       </w:tblGrid>
       <w:tr>
         <w:trPr/>
         <w:tc>
           <w:tcPr>
-            <w:tcW w:w="2799" w:type="dxa"/>
+            <w:tcW w:w="2798" w:type="dxa"/>
             <w:tcBorders>
               <w:top w:val="single" w:sz="2" w:space="0" w:color="CCCCCC"/>
               <w:left w:val="single" w:sz="2" w:space="0" w:color="CCCCCC"/>
@@ -193,7 +193,7 @@
         </w:tc>
         <w:tc>
           <w:tcPr>
-            <w:tcW w:w="6226" w:type="dxa"/>
+            <w:tcW w:w="6227" w:type="dxa"/>
             <w:tcBorders>
               <w:top w:val="single" w:sz="2" w:space="0" w:color="CCCCCC"/>
               <w:left w:val="single" w:sz="2" w:space="0" w:color="CCCCCC"/>
@@ -223,7 +223,7 @@
         <w:trPr/>
         <w:tc>
           <w:tcPr>
-            <w:tcW w:w="2799" w:type="dxa"/>
+            <w:tcW w:w="2798" w:type="dxa"/>
             <w:tcBorders>
               <w:top w:val="single" w:sz="2" w:space="0" w:color="CCCCCC"/>
               <w:left w:val="single" w:sz="2" w:space="0" w:color="CCCCCC"/>
@@ -252,7 +252,7 @@
         </w:tc>
         <w:tc>
           <w:tcPr>
-            <w:tcW w:w="6226" w:type="dxa"/>
+            <w:tcW w:w="6227" w:type="dxa"/>
             <w:tcBorders>
               <w:top w:val="single" w:sz="2" w:space="0" w:color="CCCCCC"/>
               <w:left w:val="single" w:sz="2" w:space="0" w:color="CCCCCC"/>
@@ -273,16 +273,7 @@
                 <w:sz w:val="21"/>
                 <w:szCs w:val="21"/>
               </w:rPr>
-              <w:t>Avril 202</w:t>
-            </w:r>
-            <w:r>
-              <w:rPr>
-                <w:rFonts w:eastAsia="Arial" w:cs="Arial"/>
-                <w:color w:val="333333"/>
-                <w:sz w:val="21"/>
-                <w:szCs w:val="21"/>
-              </w:rPr>
-              <w:t>6</w:t>
+              <w:t>Avril 2026</w:t>
             </w:r>
           </w:p>
         </w:tc>
@@ -291,7 +282,7 @@
         <w:trPr/>
         <w:tc>
           <w:tcPr>
-            <w:tcW w:w="2799" w:type="dxa"/>
+            <w:tcW w:w="2798" w:type="dxa"/>
             <w:tcBorders>
               <w:top w:val="single" w:sz="2" w:space="0" w:color="CCCCCC"/>
               <w:left w:val="single" w:sz="2" w:space="0" w:color="CCCCCC"/>
@@ -320,7 +311,7 @@
         </w:tc>
         <w:tc>
           <w:tcPr>
-            <w:tcW w:w="6226" w:type="dxa"/>
+            <w:tcW w:w="6227" w:type="dxa"/>
             <w:tcBorders>
               <w:top w:val="single" w:sz="2" w:space="0" w:color="CCCCCC"/>
               <w:left w:val="single" w:sz="2" w:space="0" w:color="CCCCCC"/>
@@ -350,7 +341,7 @@
         <w:trPr/>
         <w:tc>
           <w:tcPr>
-            <w:tcW w:w="2799" w:type="dxa"/>
+            <w:tcW w:w="2798" w:type="dxa"/>
             <w:tcBorders>
               <w:top w:val="single" w:sz="2" w:space="0" w:color="CCCCCC"/>
               <w:left w:val="single" w:sz="2" w:space="0" w:color="CCCCCC"/>
@@ -379,7 +370,7 @@
         </w:tc>
         <w:tc>
           <w:tcPr>
-            <w:tcW w:w="6226" w:type="dxa"/>
+            <w:tcW w:w="6227" w:type="dxa"/>
             <w:tcBorders>
               <w:top w:val="single" w:sz="2" w:space="0" w:color="CCCCCC"/>
               <w:left w:val="single" w:sz="2" w:space="0" w:color="CCCCCC"/>
@@ -409,7 +400,7 @@
         <w:trPr/>
         <w:tc>
           <w:tcPr>
-            <w:tcW w:w="2799" w:type="dxa"/>
+            <w:tcW w:w="2798" w:type="dxa"/>
             <w:tcBorders>
               <w:top w:val="single" w:sz="2" w:space="0" w:color="CCCCCC"/>
               <w:left w:val="single" w:sz="2" w:space="0" w:color="CCCCCC"/>
@@ -438,7 +429,7 @@
         </w:tc>
         <w:tc>
           <w:tcPr>
-            <w:tcW w:w="6226" w:type="dxa"/>
+            <w:tcW w:w="6227" w:type="dxa"/>
             <w:tcBorders>
               <w:top w:val="single" w:sz="2" w:space="0" w:color="CCCCCC"/>
               <w:left w:val="single" w:sz="2" w:space="0" w:color="CCCCCC"/>
@@ -539,17 +530,43 @@
         <w:p>
           <w:pPr>
             <w:pStyle w:val="Normal"/>
-            <w:rPr/>
+            <w:widowControl/>
+            <w:suppressAutoHyphens w:val="true"/>
+            <w:bidi w:val="0"/>
+            <w:spacing w:before="0" w:after="0"/>
+            <w:jc w:val="left"/>
+            <w:rPr>
+              <w:rFonts w:ascii="Arial" w:hAnsi="Arial" w:eastAsia="Arial" w:cs="Arial"/>
+              <w:color w:val="auto"/>
+              <w:kern w:val="0"/>
+              <w:sz w:val="22"/>
+              <w:szCs w:val="22"/>
+              <w:lang w:val="fr-BE" w:eastAsia="zh-CN" w:bidi="hi-IN"/>
+            </w:rPr>
           </w:pPr>
           <w:r>
             <w:fldChar w:fldCharType="begin"/>
           </w:r>
           <w:r>
-            <w:rPr/>
+            <w:rPr>
+              <w:sz w:val="22"/>
+              <w:kern w:val="0"/>
+              <w:szCs w:val="22"/>
+              <w:rFonts w:eastAsia="Arial" w:cs="Arial"/>
+              <w:color w:val="auto"/>
+              <w:lang w:val="fr-BE" w:eastAsia="zh-CN" w:bidi="hi-IN"/>
+            </w:rPr>
             <w:instrText xml:space="preserve"> TOC \o "1-3" \h</w:instrText>
           </w:r>
           <w:r>
-            <w:rPr/>
+            <w:rPr>
+              <w:sz w:val="22"/>
+              <w:kern w:val="0"/>
+              <w:szCs w:val="22"/>
+              <w:rFonts w:eastAsia="Arial" w:cs="Arial"/>
+              <w:color w:val="auto"/>
+              <w:lang w:val="fr-BE" w:eastAsia="zh-CN" w:bidi="hi-IN"/>
+            </w:rPr>
             <w:fldChar w:fldCharType="separate"/>
           </w:r>
           <w:sdt>
@@ -559,20 +576,50 @@
             </w:sdtPr>
             <w:sdtContent>
               <w:r>
-                <w:rPr/>
+                <w:rPr>
+                  <w:rFonts w:eastAsia="Arial" w:cs="Arial"/>
+                  <w:color w:val="auto"/>
+                  <w:kern w:val="0"/>
+                  <w:sz w:val="22"/>
+                  <w:szCs w:val="22"/>
+                  <w:lang w:val="fr-BE" w:eastAsia="zh-CN" w:bidi="hi-IN"/>
+                </w:rPr>
               </w:r>
               <w:r>
-                <w:rPr/>
+                <w:rPr>
+                  <w:rFonts w:eastAsia="Arial" w:cs="Arial"/>
+                  <w:color w:val="auto"/>
+                  <w:kern w:val="0"/>
+                  <w:sz w:val="22"/>
+                  <w:szCs w:val="22"/>
+                  <w:lang w:val="fr-BE" w:eastAsia="zh-CN" w:bidi="hi-IN"/>
+                </w:rPr>
               </w:r>
             </w:sdtContent>
           </w:sdt>
           <w:r>
-            <w:rPr/>
+            <w:rPr>
+              <w:sz w:val="22"/>
+              <w:kern w:val="0"/>
+              <w:szCs w:val="22"/>
+              <w:rFonts w:eastAsia="Arial" w:cs="Arial"/>
+              <w:color w:val="auto"/>
+              <w:lang w:val="fr-BE" w:eastAsia="zh-CN" w:bidi="hi-IN"/>
+            </w:rPr>
             <w:fldChar w:fldCharType="end"/>
           </w:r>
         </w:p>
       </w:sdtContent>
     </w:sdt>
+    <w:p>
+      <w:pPr>
+        <w:pStyle w:val="Normal"/>
+        <w:rPr/>
+      </w:pPr>
+      <w:r>
+        <w:rPr/>
+      </w:r>
+    </w:p>
     <w:p>
       <w:pPr>
         <w:pStyle w:val="Normal"/>
@@ -735,7 +782,7 @@
         <w:pStyle w:val="ListParagraph"/>
         <w:numPr>
           <w:ilvl w:val="0"/>
-          <w:numId w:val="3"/>
+          <w:numId w:val="4"/>
         </w:numPr>
         <w:spacing w:before="60" w:after="60"/>
         <w:rPr/>
@@ -755,7 +802,7 @@
         <w:pStyle w:val="ListParagraph"/>
         <w:numPr>
           <w:ilvl w:val="0"/>
-          <w:numId w:val="1"/>
+          <w:numId w:val="5"/>
         </w:numPr>
         <w:spacing w:before="60" w:after="60"/>
         <w:rPr/>
@@ -775,7 +822,7 @@
         <w:pStyle w:val="ListParagraph"/>
         <w:numPr>
           <w:ilvl w:val="0"/>
-          <w:numId w:val="1"/>
+          <w:numId w:val="6"/>
         </w:numPr>
         <w:spacing w:before="60" w:after="60"/>
         <w:rPr/>
@@ -795,7 +842,7 @@
         <w:pStyle w:val="ListParagraph"/>
         <w:numPr>
           <w:ilvl w:val="0"/>
-          <w:numId w:val="1"/>
+          <w:numId w:val="7"/>
         </w:numPr>
         <w:spacing w:before="60" w:after="60"/>
         <w:rPr/>
@@ -815,7 +862,7 @@
         <w:pStyle w:val="ListParagraph"/>
         <w:numPr>
           <w:ilvl w:val="0"/>
-          <w:numId w:val="1"/>
+          <w:numId w:val="8"/>
         </w:numPr>
         <w:spacing w:before="60" w:after="60"/>
         <w:rPr/>
@@ -879,7 +926,7 @@
         <w:pStyle w:val="ListParagraph"/>
         <w:numPr>
           <w:ilvl w:val="0"/>
-          <w:numId w:val="1"/>
+          <w:numId w:val="9"/>
         </w:numPr>
         <w:spacing w:before="60" w:after="60"/>
         <w:rPr/>
@@ -899,7 +946,7 @@
         <w:pStyle w:val="ListParagraph"/>
         <w:numPr>
           <w:ilvl w:val="0"/>
-          <w:numId w:val="1"/>
+          <w:numId w:val="10"/>
         </w:numPr>
         <w:spacing w:before="60" w:after="60"/>
         <w:rPr/>
@@ -919,7 +966,7 @@
         <w:pStyle w:val="ListParagraph"/>
         <w:numPr>
           <w:ilvl w:val="0"/>
-          <w:numId w:val="1"/>
+          <w:numId w:val="11"/>
         </w:numPr>
         <w:spacing w:before="60" w:after="60"/>
         <w:rPr/>
@@ -939,7 +986,7 @@
         <w:pStyle w:val="ListParagraph"/>
         <w:numPr>
           <w:ilvl w:val="0"/>
-          <w:numId w:val="1"/>
+          <w:numId w:val="12"/>
         </w:numPr>
         <w:spacing w:before="60" w:after="60"/>
         <w:rPr/>
@@ -959,7 +1006,7 @@
         <w:pStyle w:val="ListParagraph"/>
         <w:numPr>
           <w:ilvl w:val="0"/>
-          <w:numId w:val="1"/>
+          <w:numId w:val="13"/>
         </w:numPr>
         <w:spacing w:before="60" w:after="60"/>
         <w:rPr/>
@@ -979,7 +1026,7 @@
         <w:pStyle w:val="ListParagraph"/>
         <w:numPr>
           <w:ilvl w:val="0"/>
-          <w:numId w:val="1"/>
+          <w:numId w:val="14"/>
         </w:numPr>
         <w:spacing w:before="60" w:after="60"/>
         <w:rPr/>
@@ -1907,25 +1954,7 @@
                 <w:sz w:val="20"/>
                 <w:szCs w:val="20"/>
               </w:rPr>
-              <w:t>Java 2</w:t>
-            </w:r>
-            <w:r>
-              <w:rPr>
-                <w:rFonts w:eastAsia="Arial" w:cs="Arial"/>
-                <w:color w:val="333333"/>
-                <w:sz w:val="20"/>
-                <w:szCs w:val="20"/>
-              </w:rPr>
-              <w:t>5</w:t>
-            </w:r>
-            <w:r>
-              <w:rPr>
-                <w:rFonts w:eastAsia="Arial" w:cs="Arial"/>
-                <w:color w:val="333333"/>
-                <w:sz w:val="20"/>
-                <w:szCs w:val="20"/>
-              </w:rPr>
-              <w:t xml:space="preserve"> (LTS)</w:t>
+              <w:t>Java 25 (LTS)</w:t>
             </w:r>
           </w:p>
         </w:tc>
@@ -2009,16 +2038,16 @@
                 <w:sz w:val="20"/>
                 <w:szCs w:val="20"/>
               </w:rPr>
-              <w:t xml:space="preserve">Angular </w:t>
-            </w:r>
-            <w:r>
-              <w:rPr>
-                <w:rFonts w:eastAsia="Arial" w:cs="Arial"/>
-                <w:color w:val="333333"/>
-                <w:sz w:val="20"/>
-                <w:szCs w:val="20"/>
-              </w:rPr>
-              <w:t>21</w:t>
+              <w:t>Angular 2</w:t>
+            </w:r>
+            <w:r>
+              <w:rPr>
+                <w:rFonts w:eastAsia="Arial" w:cs="Arial"/>
+                <w:color w:val="333333"/>
+                <w:sz w:val="20"/>
+                <w:szCs w:val="20"/>
+              </w:rPr>
+              <w:t>2</w:t>
             </w:r>
           </w:p>
         </w:tc>
@@ -2102,16 +2131,7 @@
                 <w:sz w:val="20"/>
                 <w:szCs w:val="20"/>
               </w:rPr>
-              <w:t>PostgreSQL 1</w:t>
-            </w:r>
-            <w:r>
-              <w:rPr>
-                <w:rFonts w:eastAsia="Arial" w:cs="Arial"/>
-                <w:color w:val="333333"/>
-                <w:sz w:val="20"/>
-                <w:szCs w:val="20"/>
-              </w:rPr>
-              <w:t>7</w:t>
+              <w:t>PostgreSQL 17</w:t>
             </w:r>
           </w:p>
         </w:tc>
@@ -2195,7 +2215,25 @@
                 <w:sz w:val="20"/>
                 <w:szCs w:val="20"/>
               </w:rPr>
-              <w:t>Apache Kafka 3.x</w:t>
+              <w:t xml:space="preserve">Apache Kafka </w:t>
+            </w:r>
+            <w:r>
+              <w:rPr>
+                <w:rFonts w:eastAsia="Arial" w:cs="Arial"/>
+                <w:color w:val="333333"/>
+                <w:sz w:val="20"/>
+                <w:szCs w:val="20"/>
+              </w:rPr>
+              <w:t>4</w:t>
+            </w:r>
+            <w:r>
+              <w:rPr>
+                <w:rFonts w:eastAsia="Arial" w:cs="Arial"/>
+                <w:color w:val="333333"/>
+                <w:sz w:val="20"/>
+                <w:szCs w:val="20"/>
+              </w:rPr>
+              <w:t>.x</w:t>
             </w:r>
           </w:p>
         </w:tc>
@@ -2951,7 +2989,7 @@
                 <w:sz w:val="20"/>
                 <w:szCs w:val="20"/>
               </w:rPr>
-              <w:t xml:space="preserve">Keycloak </w:t>
+              <w:t>Keycloak</w:t>
             </w:r>
           </w:p>
         </w:tc>
@@ -4374,7 +4412,7 @@
         <w:pStyle w:val="ListParagraph"/>
         <w:numPr>
           <w:ilvl w:val="0"/>
-          <w:numId w:val="1"/>
+          <w:numId w:val="15"/>
         </w:numPr>
         <w:spacing w:before="60" w:after="60"/>
         <w:rPr/>
@@ -4394,7 +4432,7 @@
         <w:pStyle w:val="ListParagraph"/>
         <w:numPr>
           <w:ilvl w:val="0"/>
-          <w:numId w:val="1"/>
+          <w:numId w:val="16"/>
         </w:numPr>
         <w:spacing w:before="60" w:after="60"/>
         <w:rPr/>
@@ -4414,7 +4452,7 @@
         <w:pStyle w:val="ListParagraph"/>
         <w:numPr>
           <w:ilvl w:val="0"/>
-          <w:numId w:val="1"/>
+          <w:numId w:val="17"/>
         </w:numPr>
         <w:spacing w:before="60" w:after="60"/>
         <w:rPr/>
@@ -4434,7 +4472,7 @@
         <w:pStyle w:val="ListParagraph"/>
         <w:numPr>
           <w:ilvl w:val="0"/>
-          <w:numId w:val="1"/>
+          <w:numId w:val="18"/>
         </w:numPr>
         <w:spacing w:before="60" w:after="60"/>
         <w:rPr/>
@@ -4454,7 +4492,7 @@
         <w:pStyle w:val="ListParagraph"/>
         <w:numPr>
           <w:ilvl w:val="0"/>
-          <w:numId w:val="1"/>
+          <w:numId w:val="19"/>
         </w:numPr>
         <w:spacing w:before="60" w:after="60"/>
         <w:rPr/>
@@ -4474,7 +4512,7 @@
         <w:pStyle w:val="ListParagraph"/>
         <w:numPr>
           <w:ilvl w:val="0"/>
-          <w:numId w:val="1"/>
+          <w:numId w:val="20"/>
         </w:numPr>
         <w:spacing w:before="60" w:after="60"/>
         <w:rPr/>
@@ -4494,7 +4532,7 @@
         <w:pStyle w:val="ListParagraph"/>
         <w:numPr>
           <w:ilvl w:val="0"/>
-          <w:numId w:val="1"/>
+          <w:numId w:val="21"/>
         </w:numPr>
         <w:spacing w:before="60" w:after="60"/>
         <w:rPr/>
@@ -4558,7 +4596,7 @@
         <w:pStyle w:val="ListParagraph"/>
         <w:numPr>
           <w:ilvl w:val="0"/>
-          <w:numId w:val="1"/>
+          <w:numId w:val="22"/>
         </w:numPr>
         <w:spacing w:before="60" w:after="60"/>
         <w:rPr/>
@@ -4578,7 +4616,7 @@
         <w:pStyle w:val="ListParagraph"/>
         <w:numPr>
           <w:ilvl w:val="0"/>
-          <w:numId w:val="1"/>
+          <w:numId w:val="23"/>
         </w:numPr>
         <w:spacing w:before="60" w:after="60"/>
         <w:rPr/>
@@ -4598,7 +4636,7 @@
         <w:pStyle w:val="ListParagraph"/>
         <w:numPr>
           <w:ilvl w:val="0"/>
-          <w:numId w:val="1"/>
+          <w:numId w:val="24"/>
         </w:numPr>
         <w:spacing w:before="60" w:after="60"/>
         <w:rPr/>
@@ -4618,7 +4656,7 @@
         <w:pStyle w:val="ListParagraph"/>
         <w:numPr>
           <w:ilvl w:val="0"/>
-          <w:numId w:val="1"/>
+          <w:numId w:val="25"/>
         </w:numPr>
         <w:spacing w:before="60" w:after="60"/>
         <w:rPr/>
@@ -4638,7 +4676,7 @@
         <w:pStyle w:val="ListParagraph"/>
         <w:numPr>
           <w:ilvl w:val="0"/>
-          <w:numId w:val="1"/>
+          <w:numId w:val="26"/>
         </w:numPr>
         <w:spacing w:before="60" w:after="60"/>
         <w:rPr/>
@@ -4658,7 +4696,7 @@
         <w:pStyle w:val="ListParagraph"/>
         <w:numPr>
           <w:ilvl w:val="0"/>
-          <w:numId w:val="1"/>
+          <w:numId w:val="27"/>
         </w:numPr>
         <w:spacing w:before="60" w:after="60"/>
         <w:rPr/>
@@ -4844,7 +4882,7 @@
         <w:pStyle w:val="ListParagraph"/>
         <w:numPr>
           <w:ilvl w:val="0"/>
-          <w:numId w:val="1"/>
+          <w:numId w:val="28"/>
         </w:numPr>
         <w:spacing w:before="60" w:after="60"/>
         <w:rPr/>
@@ -4864,7 +4902,7 @@
         <w:pStyle w:val="ListParagraph"/>
         <w:numPr>
           <w:ilvl w:val="0"/>
-          <w:numId w:val="1"/>
+          <w:numId w:val="29"/>
         </w:numPr>
         <w:spacing w:before="60" w:after="60"/>
         <w:rPr/>
@@ -4884,7 +4922,7 @@
         <w:pStyle w:val="ListParagraph"/>
         <w:numPr>
           <w:ilvl w:val="0"/>
-          <w:numId w:val="1"/>
+          <w:numId w:val="30"/>
         </w:numPr>
         <w:spacing w:before="60" w:after="60"/>
         <w:rPr/>
@@ -4904,7 +4942,7 @@
         <w:pStyle w:val="ListParagraph"/>
         <w:numPr>
           <w:ilvl w:val="0"/>
-          <w:numId w:val="1"/>
+          <w:numId w:val="31"/>
         </w:numPr>
         <w:spacing w:before="60" w:after="60"/>
         <w:rPr/>
@@ -4924,7 +4962,7 @@
         <w:pStyle w:val="ListParagraph"/>
         <w:numPr>
           <w:ilvl w:val="0"/>
-          <w:numId w:val="1"/>
+          <w:numId w:val="32"/>
         </w:numPr>
         <w:spacing w:before="60" w:after="60"/>
         <w:rPr/>
@@ -4944,7 +4982,7 @@
         <w:pStyle w:val="ListParagraph"/>
         <w:numPr>
           <w:ilvl w:val="0"/>
-          <w:numId w:val="1"/>
+          <w:numId w:val="33"/>
         </w:numPr>
         <w:spacing w:before="60" w:after="60"/>
         <w:rPr/>
@@ -4964,7 +5002,7 @@
         <w:pStyle w:val="ListParagraph"/>
         <w:numPr>
           <w:ilvl w:val="0"/>
-          <w:numId w:val="1"/>
+          <w:numId w:val="34"/>
         </w:numPr>
         <w:spacing w:before="60" w:after="60"/>
         <w:rPr/>
@@ -5028,7 +5066,7 @@
         <w:pStyle w:val="ListParagraph"/>
         <w:numPr>
           <w:ilvl w:val="0"/>
-          <w:numId w:val="1"/>
+          <w:numId w:val="35"/>
         </w:numPr>
         <w:spacing w:before="60" w:after="60"/>
         <w:rPr/>
@@ -5048,7 +5086,7 @@
         <w:pStyle w:val="ListParagraph"/>
         <w:numPr>
           <w:ilvl w:val="0"/>
-          <w:numId w:val="1"/>
+          <w:numId w:val="36"/>
         </w:numPr>
         <w:spacing w:before="60" w:after="60"/>
         <w:rPr/>
@@ -5068,7 +5106,7 @@
         <w:pStyle w:val="ListParagraph"/>
         <w:numPr>
           <w:ilvl w:val="0"/>
-          <w:numId w:val="1"/>
+          <w:numId w:val="37"/>
         </w:numPr>
         <w:spacing w:before="60" w:after="60"/>
         <w:rPr/>
@@ -5088,7 +5126,7 @@
         <w:pStyle w:val="ListParagraph"/>
         <w:numPr>
           <w:ilvl w:val="0"/>
-          <w:numId w:val="1"/>
+          <w:numId w:val="38"/>
         </w:numPr>
         <w:spacing w:before="60" w:after="60"/>
         <w:rPr/>
@@ -5108,7 +5146,7 @@
         <w:pStyle w:val="ListParagraph"/>
         <w:numPr>
           <w:ilvl w:val="0"/>
-          <w:numId w:val="1"/>
+          <w:numId w:val="39"/>
         </w:numPr>
         <w:spacing w:before="60" w:after="60"/>
         <w:rPr/>
@@ -5172,7 +5210,7 @@
         <w:pStyle w:val="ListParagraph"/>
         <w:numPr>
           <w:ilvl w:val="0"/>
-          <w:numId w:val="1"/>
+          <w:numId w:val="40"/>
         </w:numPr>
         <w:spacing w:before="60" w:after="60"/>
         <w:rPr/>
@@ -5192,7 +5230,7 @@
         <w:pStyle w:val="ListParagraph"/>
         <w:numPr>
           <w:ilvl w:val="0"/>
-          <w:numId w:val="1"/>
+          <w:numId w:val="41"/>
         </w:numPr>
         <w:spacing w:before="60" w:after="60"/>
         <w:rPr/>
@@ -5212,7 +5250,7 @@
         <w:pStyle w:val="ListParagraph"/>
         <w:numPr>
           <w:ilvl w:val="0"/>
-          <w:numId w:val="1"/>
+          <w:numId w:val="42"/>
         </w:numPr>
         <w:spacing w:before="60" w:after="60"/>
         <w:rPr/>
@@ -5232,7 +5270,7 @@
         <w:pStyle w:val="ListParagraph"/>
         <w:numPr>
           <w:ilvl w:val="0"/>
-          <w:numId w:val="1"/>
+          <w:numId w:val="43"/>
         </w:numPr>
         <w:spacing w:before="60" w:after="60"/>
         <w:rPr/>
@@ -5252,7 +5290,7 @@
         <w:pStyle w:val="ListParagraph"/>
         <w:numPr>
           <w:ilvl w:val="0"/>
-          <w:numId w:val="1"/>
+          <w:numId w:val="44"/>
         </w:numPr>
         <w:spacing w:before="60" w:after="60"/>
         <w:rPr/>
@@ -5272,7 +5310,7 @@
         <w:pStyle w:val="ListParagraph"/>
         <w:numPr>
           <w:ilvl w:val="0"/>
-          <w:numId w:val="1"/>
+          <w:numId w:val="45"/>
         </w:numPr>
         <w:spacing w:before="60" w:after="60"/>
         <w:rPr/>
@@ -6169,7 +6207,7 @@
         <w:pStyle w:val="ListParagraph"/>
         <w:numPr>
           <w:ilvl w:val="0"/>
-          <w:numId w:val="1"/>
+          <w:numId w:val="46"/>
         </w:numPr>
         <w:spacing w:before="60" w:after="60"/>
         <w:rPr/>
@@ -6189,7 +6227,7 @@
         <w:pStyle w:val="ListParagraph"/>
         <w:numPr>
           <w:ilvl w:val="0"/>
-          <w:numId w:val="1"/>
+          <w:numId w:val="47"/>
         </w:numPr>
         <w:spacing w:before="60" w:after="60"/>
         <w:rPr/>
@@ -6209,7 +6247,7 @@
         <w:pStyle w:val="ListParagraph"/>
         <w:numPr>
           <w:ilvl w:val="0"/>
-          <w:numId w:val="1"/>
+          <w:numId w:val="48"/>
         </w:numPr>
         <w:spacing w:before="60" w:after="60"/>
         <w:rPr/>
@@ -6229,7 +6267,7 @@
         <w:pStyle w:val="ListParagraph"/>
         <w:numPr>
           <w:ilvl w:val="0"/>
-          <w:numId w:val="1"/>
+          <w:numId w:val="49"/>
         </w:numPr>
         <w:spacing w:before="60" w:after="60"/>
         <w:rPr/>
@@ -6249,7 +6287,7 @@
         <w:pStyle w:val="ListParagraph"/>
         <w:numPr>
           <w:ilvl w:val="0"/>
-          <w:numId w:val="1"/>
+          <w:numId w:val="50"/>
         </w:numPr>
         <w:spacing w:before="60" w:after="60"/>
         <w:rPr/>
@@ -6269,7 +6307,7 @@
         <w:pStyle w:val="ListParagraph"/>
         <w:numPr>
           <w:ilvl w:val="0"/>
-          <w:numId w:val="1"/>
+          <w:numId w:val="51"/>
         </w:numPr>
         <w:spacing w:before="60" w:after="60"/>
         <w:rPr/>
@@ -6333,7 +6371,7 @@
         <w:pStyle w:val="ListParagraph"/>
         <w:numPr>
           <w:ilvl w:val="0"/>
-          <w:numId w:val="1"/>
+          <w:numId w:val="52"/>
         </w:numPr>
         <w:spacing w:before="60" w:after="60"/>
         <w:rPr/>
@@ -6353,7 +6391,7 @@
         <w:pStyle w:val="ListParagraph"/>
         <w:numPr>
           <w:ilvl w:val="0"/>
-          <w:numId w:val="1"/>
+          <w:numId w:val="53"/>
         </w:numPr>
         <w:spacing w:before="60" w:after="60"/>
         <w:rPr/>
@@ -6373,7 +6411,7 @@
         <w:pStyle w:val="ListParagraph"/>
         <w:numPr>
           <w:ilvl w:val="0"/>
-          <w:numId w:val="1"/>
+          <w:numId w:val="54"/>
         </w:numPr>
         <w:spacing w:before="60" w:after="60"/>
         <w:rPr/>
@@ -6421,7 +6459,7 @@
         <w:pStyle w:val="ListParagraph"/>
         <w:numPr>
           <w:ilvl w:val="0"/>
-          <w:numId w:val="1"/>
+          <w:numId w:val="55"/>
         </w:numPr>
         <w:spacing w:before="60" w:after="60"/>
         <w:rPr/>
@@ -6441,7 +6479,7 @@
         <w:pStyle w:val="ListParagraph"/>
         <w:numPr>
           <w:ilvl w:val="0"/>
-          <w:numId w:val="1"/>
+          <w:numId w:val="56"/>
         </w:numPr>
         <w:spacing w:before="60" w:after="60"/>
         <w:rPr/>
@@ -6461,7 +6499,7 @@
         <w:pStyle w:val="ListParagraph"/>
         <w:numPr>
           <w:ilvl w:val="0"/>
-          <w:numId w:val="1"/>
+          <w:numId w:val="57"/>
         </w:numPr>
         <w:spacing w:before="60" w:after="60"/>
         <w:rPr/>
@@ -6481,7 +6519,7 @@
         <w:pStyle w:val="ListParagraph"/>
         <w:numPr>
           <w:ilvl w:val="0"/>
-          <w:numId w:val="1"/>
+          <w:numId w:val="58"/>
         </w:numPr>
         <w:spacing w:before="60" w:after="60"/>
         <w:rPr/>
@@ -6501,7 +6539,7 @@
         <w:pStyle w:val="ListParagraph"/>
         <w:numPr>
           <w:ilvl w:val="0"/>
-          <w:numId w:val="1"/>
+          <w:numId w:val="59"/>
         </w:numPr>
         <w:spacing w:before="60" w:after="60"/>
         <w:rPr/>
@@ -6653,7 +6691,7 @@
         <w:pStyle w:val="ListParagraph"/>
         <w:numPr>
           <w:ilvl w:val="0"/>
-          <w:numId w:val="1"/>
+          <w:numId w:val="60"/>
         </w:numPr>
         <w:spacing w:before="60" w:after="60"/>
         <w:rPr/>
@@ -6673,7 +6711,7 @@
         <w:pStyle w:val="ListParagraph"/>
         <w:numPr>
           <w:ilvl w:val="0"/>
-          <w:numId w:val="1"/>
+          <w:numId w:val="61"/>
         </w:numPr>
         <w:spacing w:before="60" w:after="60"/>
         <w:rPr/>
@@ -6693,7 +6731,7 @@
         <w:pStyle w:val="ListParagraph"/>
         <w:numPr>
           <w:ilvl w:val="0"/>
-          <w:numId w:val="1"/>
+          <w:numId w:val="62"/>
         </w:numPr>
         <w:spacing w:before="60" w:after="60"/>
         <w:rPr/>
@@ -6713,7 +6751,7 @@
         <w:pStyle w:val="ListParagraph"/>
         <w:numPr>
           <w:ilvl w:val="0"/>
-          <w:numId w:val="1"/>
+          <w:numId w:val="63"/>
         </w:numPr>
         <w:spacing w:before="60" w:after="60"/>
         <w:rPr/>
@@ -6733,7 +6771,7 @@
         <w:pStyle w:val="ListParagraph"/>
         <w:numPr>
           <w:ilvl w:val="0"/>
-          <w:numId w:val="1"/>
+          <w:numId w:val="64"/>
         </w:numPr>
         <w:spacing w:before="60" w:after="60"/>
         <w:rPr/>
@@ -6753,7 +6791,7 @@
         <w:pStyle w:val="ListParagraph"/>
         <w:numPr>
           <w:ilvl w:val="0"/>
-          <w:numId w:val="1"/>
+          <w:numId w:val="65"/>
         </w:numPr>
         <w:spacing w:before="60" w:after="60"/>
         <w:rPr/>
@@ -6773,7 +6811,7 @@
         <w:pStyle w:val="ListParagraph"/>
         <w:numPr>
           <w:ilvl w:val="0"/>
-          <w:numId w:val="1"/>
+          <w:numId w:val="66"/>
         </w:numPr>
         <w:spacing w:before="60" w:after="60"/>
         <w:rPr/>
@@ -6821,7 +6859,7 @@
         <w:pStyle w:val="ListParagraph"/>
         <w:numPr>
           <w:ilvl w:val="0"/>
-          <w:numId w:val="1"/>
+          <w:numId w:val="67"/>
         </w:numPr>
         <w:spacing w:before="60" w:after="60"/>
         <w:rPr/>
@@ -6841,7 +6879,7 @@
         <w:pStyle w:val="ListParagraph"/>
         <w:numPr>
           <w:ilvl w:val="0"/>
-          <w:numId w:val="1"/>
+          <w:numId w:val="68"/>
         </w:numPr>
         <w:spacing w:before="60" w:after="60"/>
         <w:rPr/>
@@ -6861,7 +6899,7 @@
         <w:pStyle w:val="ListParagraph"/>
         <w:numPr>
           <w:ilvl w:val="0"/>
-          <w:numId w:val="1"/>
+          <w:numId w:val="69"/>
         </w:numPr>
         <w:spacing w:before="60" w:after="60"/>
         <w:rPr/>
@@ -6881,7 +6919,7 @@
         <w:pStyle w:val="ListParagraph"/>
         <w:numPr>
           <w:ilvl w:val="0"/>
-          <w:numId w:val="1"/>
+          <w:numId w:val="70"/>
         </w:numPr>
         <w:spacing w:before="60" w:after="60"/>
         <w:rPr/>
@@ -6901,7 +6939,7 @@
         <w:pStyle w:val="ListParagraph"/>
         <w:numPr>
           <w:ilvl w:val="0"/>
-          <w:numId w:val="1"/>
+          <w:numId w:val="71"/>
         </w:numPr>
         <w:spacing w:before="60" w:after="60"/>
         <w:rPr/>
@@ -6921,7 +6959,7 @@
         <w:pStyle w:val="ListParagraph"/>
         <w:numPr>
           <w:ilvl w:val="0"/>
-          <w:numId w:val="1"/>
+          <w:numId w:val="72"/>
         </w:numPr>
         <w:spacing w:before="60" w:after="60"/>
         <w:rPr/>
@@ -6978,14 +7016,14 @@
         </w:tblCellMar>
       </w:tblPr>
       <w:tblGrid>
-        <w:gridCol w:w="2799"/>
-        <w:gridCol w:w="6226"/>
+        <w:gridCol w:w="2798"/>
+        <w:gridCol w:w="6227"/>
       </w:tblGrid>
       <w:tr>
         <w:trPr/>
         <w:tc>
           <w:tcPr>
-            <w:tcW w:w="2799" w:type="dxa"/>
+            <w:tcW w:w="2798" w:type="dxa"/>
             <w:tcBorders>
               <w:top w:val="single" w:sz="2" w:space="0" w:color="CCCCCC"/>
               <w:left w:val="single" w:sz="2" w:space="0" w:color="CCCCCC"/>
@@ -7014,7 +7052,7 @@
         </w:tc>
         <w:tc>
           <w:tcPr>
-            <w:tcW w:w="6226" w:type="dxa"/>
+            <w:tcW w:w="6227" w:type="dxa"/>
             <w:tcBorders>
               <w:top w:val="single" w:sz="2" w:space="0" w:color="CCCCCC"/>
               <w:left w:val="single" w:sz="2" w:space="0" w:color="CCCCCC"/>
@@ -7044,7 +7082,7 @@
         <w:trPr/>
         <w:tc>
           <w:tcPr>
-            <w:tcW w:w="2799" w:type="dxa"/>
+            <w:tcW w:w="2798" w:type="dxa"/>
             <w:tcBorders>
               <w:top w:val="single" w:sz="2" w:space="0" w:color="CCCCCC"/>
               <w:left w:val="single" w:sz="2" w:space="0" w:color="CCCCCC"/>
@@ -7073,7 +7111,7 @@
         </w:tc>
         <w:tc>
           <w:tcPr>
-            <w:tcW w:w="6226" w:type="dxa"/>
+            <w:tcW w:w="6227" w:type="dxa"/>
             <w:tcBorders>
               <w:top w:val="single" w:sz="2" w:space="0" w:color="CCCCCC"/>
               <w:left w:val="single" w:sz="2" w:space="0" w:color="CCCCCC"/>
@@ -7103,7 +7141,7 @@
         <w:trPr/>
         <w:tc>
           <w:tcPr>
-            <w:tcW w:w="2799" w:type="dxa"/>
+            <w:tcW w:w="2798" w:type="dxa"/>
             <w:tcBorders>
               <w:top w:val="single" w:sz="2" w:space="0" w:color="CCCCCC"/>
               <w:left w:val="single" w:sz="2" w:space="0" w:color="CCCCCC"/>
@@ -7132,7 +7170,7 @@
         </w:tc>
         <w:tc>
           <w:tcPr>
-            <w:tcW w:w="6226" w:type="dxa"/>
+            <w:tcW w:w="6227" w:type="dxa"/>
             <w:tcBorders>
               <w:top w:val="single" w:sz="2" w:space="0" w:color="CCCCCC"/>
               <w:left w:val="single" w:sz="2" w:space="0" w:color="CCCCCC"/>
@@ -7162,7 +7200,7 @@
         <w:trPr/>
         <w:tc>
           <w:tcPr>
-            <w:tcW w:w="2799" w:type="dxa"/>
+            <w:tcW w:w="2798" w:type="dxa"/>
             <w:tcBorders>
               <w:top w:val="single" w:sz="2" w:space="0" w:color="CCCCCC"/>
               <w:left w:val="single" w:sz="2" w:space="0" w:color="CCCCCC"/>
@@ -7191,7 +7229,7 @@
         </w:tc>
         <w:tc>
           <w:tcPr>
-            <w:tcW w:w="6226" w:type="dxa"/>
+            <w:tcW w:w="6227" w:type="dxa"/>
             <w:tcBorders>
               <w:top w:val="single" w:sz="2" w:space="0" w:color="CCCCCC"/>
               <w:left w:val="single" w:sz="2" w:space="0" w:color="CCCCCC"/>
@@ -7221,7 +7259,7 @@
         <w:trPr/>
         <w:tc>
           <w:tcPr>
-            <w:tcW w:w="2799" w:type="dxa"/>
+            <w:tcW w:w="2798" w:type="dxa"/>
             <w:tcBorders>
               <w:top w:val="single" w:sz="2" w:space="0" w:color="CCCCCC"/>
               <w:left w:val="single" w:sz="2" w:space="0" w:color="CCCCCC"/>
@@ -7250,7 +7288,7 @@
         </w:tc>
         <w:tc>
           <w:tcPr>
-            <w:tcW w:w="6226" w:type="dxa"/>
+            <w:tcW w:w="6227" w:type="dxa"/>
             <w:tcBorders>
               <w:top w:val="single" w:sz="2" w:space="0" w:color="CCCCCC"/>
               <w:left w:val="single" w:sz="2" w:space="0" w:color="CCCCCC"/>
@@ -7280,7 +7318,7 @@
         <w:trPr/>
         <w:tc>
           <w:tcPr>
-            <w:tcW w:w="2799" w:type="dxa"/>
+            <w:tcW w:w="2798" w:type="dxa"/>
             <w:tcBorders>
               <w:top w:val="single" w:sz="2" w:space="0" w:color="CCCCCC"/>
               <w:left w:val="single" w:sz="2" w:space="0" w:color="CCCCCC"/>
@@ -7309,7 +7347,7 @@
         </w:tc>
         <w:tc>
           <w:tcPr>
-            <w:tcW w:w="6226" w:type="dxa"/>
+            <w:tcW w:w="6227" w:type="dxa"/>
             <w:tcBorders>
               <w:top w:val="single" w:sz="2" w:space="0" w:color="CCCCCC"/>
               <w:left w:val="single" w:sz="2" w:space="0" w:color="CCCCCC"/>
@@ -8124,7 +8162,7 @@
         <w:pStyle w:val="ListParagraph"/>
         <w:numPr>
           <w:ilvl w:val="0"/>
-          <w:numId w:val="1"/>
+          <w:numId w:val="73"/>
         </w:numPr>
         <w:spacing w:before="60" w:after="60"/>
         <w:rPr/>
@@ -8144,7 +8182,7 @@
         <w:pStyle w:val="ListParagraph"/>
         <w:numPr>
           <w:ilvl w:val="0"/>
-          <w:numId w:val="1"/>
+          <w:numId w:val="74"/>
         </w:numPr>
         <w:spacing w:before="60" w:after="60"/>
         <w:rPr/>
@@ -8164,7 +8202,7 @@
         <w:pStyle w:val="ListParagraph"/>
         <w:numPr>
           <w:ilvl w:val="0"/>
-          <w:numId w:val="1"/>
+          <w:numId w:val="75"/>
         </w:numPr>
         <w:spacing w:before="60" w:after="60"/>
         <w:rPr/>
@@ -8184,7 +8222,7 @@
         <w:pStyle w:val="ListParagraph"/>
         <w:numPr>
           <w:ilvl w:val="0"/>
-          <w:numId w:val="1"/>
+          <w:numId w:val="76"/>
         </w:numPr>
         <w:spacing w:before="60" w:after="60"/>
         <w:rPr/>
@@ -8204,7 +8242,7 @@
         <w:pStyle w:val="ListParagraph"/>
         <w:numPr>
           <w:ilvl w:val="0"/>
-          <w:numId w:val="1"/>
+          <w:numId w:val="77"/>
         </w:numPr>
         <w:spacing w:before="60" w:after="60"/>
         <w:rPr/>
@@ -8224,7 +8262,7 @@
         <w:pStyle w:val="ListParagraph"/>
         <w:numPr>
           <w:ilvl w:val="0"/>
-          <w:numId w:val="1"/>
+          <w:numId w:val="78"/>
         </w:numPr>
         <w:spacing w:before="60" w:after="60"/>
         <w:rPr/>
@@ -9565,7 +9603,7 @@
         <w:pStyle w:val="ListParagraph"/>
         <w:numPr>
           <w:ilvl w:val="0"/>
-          <w:numId w:val="1"/>
+          <w:numId w:val="79"/>
         </w:numPr>
         <w:spacing w:before="60" w:after="60"/>
         <w:rPr/>
@@ -9585,7 +9623,7 @@
         <w:pStyle w:val="ListParagraph"/>
         <w:numPr>
           <w:ilvl w:val="0"/>
-          <w:numId w:val="1"/>
+          <w:numId w:val="80"/>
         </w:numPr>
         <w:spacing w:before="60" w:after="60"/>
         <w:rPr/>
@@ -9605,7 +9643,7 @@
         <w:pStyle w:val="ListParagraph"/>
         <w:numPr>
           <w:ilvl w:val="0"/>
-          <w:numId w:val="1"/>
+          <w:numId w:val="81"/>
         </w:numPr>
         <w:spacing w:before="60" w:after="60"/>
         <w:rPr/>
@@ -9625,7 +9663,7 @@
         <w:pStyle w:val="ListParagraph"/>
         <w:numPr>
           <w:ilvl w:val="0"/>
-          <w:numId w:val="1"/>
+          <w:numId w:val="82"/>
         </w:numPr>
         <w:spacing w:before="60" w:after="60"/>
         <w:rPr/>
@@ -9645,7 +9683,7 @@
         <w:pStyle w:val="ListParagraph"/>
         <w:numPr>
           <w:ilvl w:val="0"/>
-          <w:numId w:val="1"/>
+          <w:numId w:val="83"/>
         </w:numPr>
         <w:spacing w:before="60" w:after="60"/>
         <w:rPr/>
@@ -9779,15 +9817,15 @@
         </w:tblCellMar>
       </w:tblPr>
       <w:tblGrid>
-        <w:gridCol w:w="2199"/>
-        <w:gridCol w:w="2601"/>
+        <w:gridCol w:w="2198"/>
+        <w:gridCol w:w="2602"/>
         <w:gridCol w:w="4226"/>
       </w:tblGrid>
       <w:tr>
         <w:trPr/>
         <w:tc>
           <w:tcPr>
-            <w:tcW w:w="2199" w:type="dxa"/>
+            <w:tcW w:w="2198" w:type="dxa"/>
             <w:tcBorders>
               <w:top w:val="single" w:sz="2" w:space="0" w:color="CCCCCC"/>
               <w:left w:val="single" w:sz="2" w:space="0" w:color="CCCCCC"/>
@@ -9816,7 +9854,7 @@
         </w:tc>
         <w:tc>
           <w:tcPr>
-            <w:tcW w:w="2601" w:type="dxa"/>
+            <w:tcW w:w="2602" w:type="dxa"/>
             <w:tcBorders>
               <w:top w:val="single" w:sz="2" w:space="0" w:color="CCCCCC"/>
               <w:left w:val="single" w:sz="2" w:space="0" w:color="CCCCCC"/>
@@ -9877,7 +9915,7 @@
         <w:trPr/>
         <w:tc>
           <w:tcPr>
-            <w:tcW w:w="2199" w:type="dxa"/>
+            <w:tcW w:w="2198" w:type="dxa"/>
             <w:tcBorders>
               <w:top w:val="single" w:sz="2" w:space="0" w:color="CCCCCC"/>
               <w:left w:val="single" w:sz="2" w:space="0" w:color="CCCCCC"/>
@@ -9904,7 +9942,7 @@
         </w:tc>
         <w:tc>
           <w:tcPr>
-            <w:tcW w:w="2601" w:type="dxa"/>
+            <w:tcW w:w="2602" w:type="dxa"/>
             <w:tcBorders>
               <w:top w:val="single" w:sz="2" w:space="0" w:color="CCCCCC"/>
               <w:left w:val="single" w:sz="2" w:space="0" w:color="CCCCCC"/>
@@ -9961,7 +9999,7 @@
         <w:trPr/>
         <w:tc>
           <w:tcPr>
-            <w:tcW w:w="2199" w:type="dxa"/>
+            <w:tcW w:w="2198" w:type="dxa"/>
             <w:tcBorders>
               <w:top w:val="single" w:sz="2" w:space="0" w:color="CCCCCC"/>
               <w:left w:val="single" w:sz="2" w:space="0" w:color="CCCCCC"/>
@@ -9988,7 +10026,7 @@
         </w:tc>
         <w:tc>
           <w:tcPr>
-            <w:tcW w:w="2601" w:type="dxa"/>
+            <w:tcW w:w="2602" w:type="dxa"/>
             <w:tcBorders>
               <w:top w:val="single" w:sz="2" w:space="0" w:color="CCCCCC"/>
               <w:left w:val="single" w:sz="2" w:space="0" w:color="CCCCCC"/>
@@ -10045,7 +10083,7 @@
         <w:trPr/>
         <w:tc>
           <w:tcPr>
-            <w:tcW w:w="2199" w:type="dxa"/>
+            <w:tcW w:w="2198" w:type="dxa"/>
             <w:tcBorders>
               <w:top w:val="single" w:sz="2" w:space="0" w:color="CCCCCC"/>
               <w:left w:val="single" w:sz="2" w:space="0" w:color="CCCCCC"/>
@@ -10072,7 +10110,7 @@
         </w:tc>
         <w:tc>
           <w:tcPr>
-            <w:tcW w:w="2601" w:type="dxa"/>
+            <w:tcW w:w="2602" w:type="dxa"/>
             <w:tcBorders>
               <w:top w:val="single" w:sz="2" w:space="0" w:color="CCCCCC"/>
               <w:left w:val="single" w:sz="2" w:space="0" w:color="CCCCCC"/>
@@ -10129,7 +10167,7 @@
         <w:trPr/>
         <w:tc>
           <w:tcPr>
-            <w:tcW w:w="2199" w:type="dxa"/>
+            <w:tcW w:w="2198" w:type="dxa"/>
             <w:tcBorders>
               <w:top w:val="single" w:sz="2" w:space="0" w:color="CCCCCC"/>
               <w:left w:val="single" w:sz="2" w:space="0" w:color="CCCCCC"/>
@@ -10156,7 +10194,7 @@
         </w:tc>
         <w:tc>
           <w:tcPr>
-            <w:tcW w:w="2601" w:type="dxa"/>
+            <w:tcW w:w="2602" w:type="dxa"/>
             <w:tcBorders>
               <w:top w:val="single" w:sz="2" w:space="0" w:color="CCCCCC"/>
               <w:left w:val="single" w:sz="2" w:space="0" w:color="CCCCCC"/>
@@ -10213,7 +10251,7 @@
         <w:trPr/>
         <w:tc>
           <w:tcPr>
-            <w:tcW w:w="2199" w:type="dxa"/>
+            <w:tcW w:w="2198" w:type="dxa"/>
             <w:tcBorders>
               <w:top w:val="single" w:sz="2" w:space="0" w:color="CCCCCC"/>
               <w:left w:val="single" w:sz="2" w:space="0" w:color="CCCCCC"/>
@@ -10240,7 +10278,7 @@
         </w:tc>
         <w:tc>
           <w:tcPr>
-            <w:tcW w:w="2601" w:type="dxa"/>
+            <w:tcW w:w="2602" w:type="dxa"/>
             <w:tcBorders>
               <w:top w:val="single" w:sz="2" w:space="0" w:color="CCCCCC"/>
               <w:left w:val="single" w:sz="2" w:space="0" w:color="CCCCCC"/>
@@ -10297,7 +10335,7 @@
         <w:trPr/>
         <w:tc>
           <w:tcPr>
-            <w:tcW w:w="2199" w:type="dxa"/>
+            <w:tcW w:w="2198" w:type="dxa"/>
             <w:tcBorders>
               <w:top w:val="single" w:sz="2" w:space="0" w:color="CCCCCC"/>
               <w:left w:val="single" w:sz="2" w:space="0" w:color="CCCCCC"/>
@@ -10324,7 +10362,7 @@
         </w:tc>
         <w:tc>
           <w:tcPr>
-            <w:tcW w:w="2601" w:type="dxa"/>
+            <w:tcW w:w="2602" w:type="dxa"/>
             <w:tcBorders>
               <w:top w:val="single" w:sz="2" w:space="0" w:color="CCCCCC"/>
               <w:left w:val="single" w:sz="2" w:space="0" w:color="CCCCCC"/>
@@ -10381,7 +10419,7 @@
         <w:trPr/>
         <w:tc>
           <w:tcPr>
-            <w:tcW w:w="2199" w:type="dxa"/>
+            <w:tcW w:w="2198" w:type="dxa"/>
             <w:tcBorders>
               <w:top w:val="single" w:sz="2" w:space="0" w:color="CCCCCC"/>
               <w:left w:val="single" w:sz="2" w:space="0" w:color="CCCCCC"/>
@@ -10408,7 +10446,7 @@
         </w:tc>
         <w:tc>
           <w:tcPr>
-            <w:tcW w:w="2601" w:type="dxa"/>
+            <w:tcW w:w="2602" w:type="dxa"/>
             <w:tcBorders>
               <w:top w:val="single" w:sz="2" w:space="0" w:color="CCCCCC"/>
               <w:left w:val="single" w:sz="2" w:space="0" w:color="CCCCCC"/>
@@ -10465,7 +10503,7 @@
         <w:trPr/>
         <w:tc>
           <w:tcPr>
-            <w:tcW w:w="2199" w:type="dxa"/>
+            <w:tcW w:w="2198" w:type="dxa"/>
             <w:tcBorders>
               <w:top w:val="single" w:sz="2" w:space="0" w:color="CCCCCC"/>
               <w:left w:val="single" w:sz="2" w:space="0" w:color="CCCCCC"/>
@@ -10492,7 +10530,7 @@
         </w:tc>
         <w:tc>
           <w:tcPr>
-            <w:tcW w:w="2601" w:type="dxa"/>
+            <w:tcW w:w="2602" w:type="dxa"/>
             <w:tcBorders>
               <w:top w:val="single" w:sz="2" w:space="0" w:color="CCCCCC"/>
               <w:left w:val="single" w:sz="2" w:space="0" w:color="CCCCCC"/>
@@ -10549,7 +10587,7 @@
         <w:trPr/>
         <w:tc>
           <w:tcPr>
-            <w:tcW w:w="2199" w:type="dxa"/>
+            <w:tcW w:w="2198" w:type="dxa"/>
             <w:tcBorders>
               <w:top w:val="single" w:sz="2" w:space="0" w:color="CCCCCC"/>
               <w:left w:val="single" w:sz="2" w:space="0" w:color="CCCCCC"/>
@@ -10576,7 +10614,7 @@
         </w:tc>
         <w:tc>
           <w:tcPr>
-            <w:tcW w:w="2601" w:type="dxa"/>
+            <w:tcW w:w="2602" w:type="dxa"/>
             <w:tcBorders>
               <w:top w:val="single" w:sz="2" w:space="0" w:color="CCCCCC"/>
               <w:left w:val="single" w:sz="2" w:space="0" w:color="CCCCCC"/>
@@ -10633,7 +10671,7 @@
         <w:trPr/>
         <w:tc>
           <w:tcPr>
-            <w:tcW w:w="2199" w:type="dxa"/>
+            <w:tcW w:w="2198" w:type="dxa"/>
             <w:tcBorders>
               <w:top w:val="single" w:sz="2" w:space="0" w:color="CCCCCC"/>
               <w:left w:val="single" w:sz="2" w:space="0" w:color="CCCCCC"/>
@@ -10660,7 +10698,7 @@
         </w:tc>
         <w:tc>
           <w:tcPr>
-            <w:tcW w:w="2601" w:type="dxa"/>
+            <w:tcW w:w="2602" w:type="dxa"/>
             <w:tcBorders>
               <w:top w:val="single" w:sz="2" w:space="0" w:color="CCCCCC"/>
               <w:left w:val="single" w:sz="2" w:space="0" w:color="CCCCCC"/>
@@ -10717,7 +10755,7 @@
         <w:trPr/>
         <w:tc>
           <w:tcPr>
-            <w:tcW w:w="2199" w:type="dxa"/>
+            <w:tcW w:w="2198" w:type="dxa"/>
             <w:tcBorders>
               <w:top w:val="single" w:sz="2" w:space="0" w:color="CCCCCC"/>
               <w:left w:val="single" w:sz="2" w:space="0" w:color="CCCCCC"/>
@@ -10744,7 +10782,7 @@
         </w:tc>
         <w:tc>
           <w:tcPr>
-            <w:tcW w:w="2601" w:type="dxa"/>
+            <w:tcW w:w="2602" w:type="dxa"/>
             <w:tcBorders>
               <w:top w:val="single" w:sz="2" w:space="0" w:color="CCCCCC"/>
               <w:left w:val="single" w:sz="2" w:space="0" w:color="CCCCCC"/>
@@ -10801,7 +10839,7 @@
         <w:trPr/>
         <w:tc>
           <w:tcPr>
-            <w:tcW w:w="2199" w:type="dxa"/>
+            <w:tcW w:w="2198" w:type="dxa"/>
             <w:tcBorders>
               <w:top w:val="single" w:sz="2" w:space="0" w:color="CCCCCC"/>
               <w:left w:val="single" w:sz="2" w:space="0" w:color="CCCCCC"/>
@@ -10828,7 +10866,7 @@
         </w:tc>
         <w:tc>
           <w:tcPr>
-            <w:tcW w:w="2601" w:type="dxa"/>
+            <w:tcW w:w="2602" w:type="dxa"/>
             <w:tcBorders>
               <w:top w:val="single" w:sz="2" w:space="0" w:color="CCCCCC"/>
               <w:left w:val="single" w:sz="2" w:space="0" w:color="CCCCCC"/>
@@ -10915,7 +10953,7 @@
         <w:pStyle w:val="ListParagraph"/>
         <w:numPr>
           <w:ilvl w:val="0"/>
-          <w:numId w:val="1"/>
+          <w:numId w:val="84"/>
         </w:numPr>
         <w:spacing w:before="60" w:after="60"/>
         <w:rPr/>
@@ -10935,7 +10973,7 @@
         <w:pStyle w:val="ListParagraph"/>
         <w:numPr>
           <w:ilvl w:val="0"/>
-          <w:numId w:val="1"/>
+          <w:numId w:val="85"/>
         </w:numPr>
         <w:spacing w:before="60" w:after="60"/>
         <w:rPr/>
@@ -10955,7 +10993,7 @@
         <w:pStyle w:val="ListParagraph"/>
         <w:numPr>
           <w:ilvl w:val="0"/>
-          <w:numId w:val="1"/>
+          <w:numId w:val="86"/>
         </w:numPr>
         <w:spacing w:before="60" w:after="60"/>
         <w:rPr/>
@@ -10975,7 +11013,7 @@
         <w:pStyle w:val="ListParagraph"/>
         <w:numPr>
           <w:ilvl w:val="0"/>
-          <w:numId w:val="1"/>
+          <w:numId w:val="87"/>
         </w:numPr>
         <w:spacing w:before="60" w:after="60"/>
         <w:rPr/>
@@ -10995,7 +11033,7 @@
         <w:pStyle w:val="ListParagraph"/>
         <w:numPr>
           <w:ilvl w:val="0"/>
-          <w:numId w:val="1"/>
+          <w:numId w:val="88"/>
         </w:numPr>
         <w:spacing w:before="60" w:after="60"/>
         <w:rPr/>
@@ -11015,7 +11053,7 @@
         <w:pStyle w:val="ListParagraph"/>
         <w:numPr>
           <w:ilvl w:val="0"/>
-          <w:numId w:val="1"/>
+          <w:numId w:val="89"/>
         </w:numPr>
         <w:spacing w:before="60" w:after="60"/>
         <w:rPr/>
@@ -11060,18 +11098,7 @@
           <w:sz w:val="32"/>
           <w:szCs w:val="32"/>
         </w:rPr>
-        <w:t xml:space="preserve">7. Frontend Angular </w:t>
-      </w:r>
-      <w:r>
-        <w:rPr>
-          <w:rFonts w:eastAsia="Arial" w:cs="Arial" w:ascii="Arial" w:hAnsi="Arial"/>
-          <w:b/>
-          <w:bCs/>
-          <w:color w:val="1A5C8A"/>
-          <w:sz w:val="32"/>
-          <w:szCs w:val="32"/>
-        </w:rPr>
-        <w:t>21</w:t>
+        <w:t>7. Frontend Angular 21</w:t>
       </w:r>
     </w:p>
     <w:p>
@@ -11107,7 +11134,7 @@
         <w:pStyle w:val="ListParagraph"/>
         <w:numPr>
           <w:ilvl w:val="0"/>
-          <w:numId w:val="1"/>
+          <w:numId w:val="90"/>
         </w:numPr>
         <w:spacing w:before="60" w:after="60"/>
         <w:rPr/>
@@ -11119,16 +11146,7 @@
           <w:sz w:val="22"/>
           <w:szCs w:val="22"/>
         </w:rPr>
-        <w:t xml:space="preserve">Architecture standalone components (sans NgModules) — standard Angular </w:t>
-      </w:r>
-      <w:r>
-        <w:rPr>
-          <w:rFonts w:eastAsia="Arial" w:cs="Arial"/>
-          <w:color w:val="333333"/>
-          <w:sz w:val="22"/>
-          <w:szCs w:val="22"/>
-        </w:rPr>
-        <w:t>21</w:t>
+        <w:t>Architecture standalone components (sans NgModules) — standard Angular 21</w:t>
       </w:r>
     </w:p>
     <w:p>
@@ -11136,7 +11154,7 @@
         <w:pStyle w:val="ListParagraph"/>
         <w:numPr>
           <w:ilvl w:val="0"/>
-          <w:numId w:val="1"/>
+          <w:numId w:val="91"/>
         </w:numPr>
         <w:spacing w:before="60" w:after="60"/>
         <w:rPr/>
@@ -11156,7 +11174,7 @@
         <w:pStyle w:val="ListParagraph"/>
         <w:numPr>
           <w:ilvl w:val="0"/>
-          <w:numId w:val="1"/>
+          <w:numId w:val="92"/>
         </w:numPr>
         <w:spacing w:before="60" w:after="60"/>
         <w:rPr/>
@@ -11176,7 +11194,7 @@
         <w:pStyle w:val="ListParagraph"/>
         <w:numPr>
           <w:ilvl w:val="0"/>
-          <w:numId w:val="1"/>
+          <w:numId w:val="93"/>
         </w:numPr>
         <w:spacing w:before="60" w:after="60"/>
         <w:rPr/>
@@ -11188,25 +11206,7 @@
           <w:sz w:val="22"/>
           <w:szCs w:val="22"/>
         </w:rPr>
-        <w:t xml:space="preserve">Angular </w:t>
-      </w:r>
-      <w:r>
-        <w:rPr>
-          <w:rFonts w:eastAsia="Arial" w:cs="Arial"/>
-          <w:color w:val="333333"/>
-          <w:sz w:val="22"/>
-          <w:szCs w:val="22"/>
-        </w:rPr>
-        <w:t>PrimeNG</w:t>
-      </w:r>
-      <w:r>
-        <w:rPr>
-          <w:rFonts w:eastAsia="Arial" w:cs="Arial"/>
-          <w:color w:val="333333"/>
-          <w:sz w:val="22"/>
-          <w:szCs w:val="22"/>
-        </w:rPr>
-        <w:t xml:space="preserve">  comme bibliothèque de composants UI (thème personnalisé CareSync)</w:t>
+        <w:t>Angular PrimeNG  comme bibliothèque de composants UI (thème personnalisé CareSync)</w:t>
       </w:r>
     </w:p>
     <w:p>
@@ -11214,7 +11214,7 @@
         <w:pStyle w:val="ListParagraph"/>
         <w:numPr>
           <w:ilvl w:val="0"/>
-          <w:numId w:val="1"/>
+          <w:numId w:val="94"/>
         </w:numPr>
         <w:spacing w:before="60" w:after="60"/>
         <w:rPr/>
@@ -11234,7 +11234,7 @@
         <w:pStyle w:val="ListParagraph"/>
         <w:numPr>
           <w:ilvl w:val="0"/>
-          <w:numId w:val="1"/>
+          <w:numId w:val="95"/>
         </w:numPr>
         <w:spacing w:before="60" w:after="60"/>
         <w:rPr/>
@@ -11291,15 +11291,15 @@
         </w:tblCellMar>
       </w:tblPr>
       <w:tblGrid>
-        <w:gridCol w:w="2799"/>
-        <w:gridCol w:w="3501"/>
+        <w:gridCol w:w="2798"/>
+        <w:gridCol w:w="3502"/>
         <w:gridCol w:w="2726"/>
       </w:tblGrid>
       <w:tr>
         <w:trPr/>
         <w:tc>
           <w:tcPr>
-            <w:tcW w:w="2799" w:type="dxa"/>
+            <w:tcW w:w="2798" w:type="dxa"/>
             <w:tcBorders>
               <w:top w:val="single" w:sz="2" w:space="0" w:color="CCCCCC"/>
               <w:left w:val="single" w:sz="2" w:space="0" w:color="CCCCCC"/>
@@ -11328,7 +11328,7 @@
         </w:tc>
         <w:tc>
           <w:tcPr>
-            <w:tcW w:w="3501" w:type="dxa"/>
+            <w:tcW w:w="3502" w:type="dxa"/>
             <w:tcBorders>
               <w:top w:val="single" w:sz="2" w:space="0" w:color="CCCCCC"/>
               <w:left w:val="single" w:sz="2" w:space="0" w:color="CCCCCC"/>
@@ -11389,7 +11389,7 @@
         <w:trPr/>
         <w:tc>
           <w:tcPr>
-            <w:tcW w:w="2799" w:type="dxa"/>
+            <w:tcW w:w="2798" w:type="dxa"/>
             <w:tcBorders>
               <w:top w:val="single" w:sz="2" w:space="0" w:color="CCCCCC"/>
               <w:left w:val="single" w:sz="2" w:space="0" w:color="CCCCCC"/>
@@ -11416,7 +11416,7 @@
         </w:tc>
         <w:tc>
           <w:tcPr>
-            <w:tcW w:w="3501" w:type="dxa"/>
+            <w:tcW w:w="3502" w:type="dxa"/>
             <w:tcBorders>
               <w:top w:val="single" w:sz="2" w:space="0" w:color="CCCCCC"/>
               <w:left w:val="single" w:sz="2" w:space="0" w:color="CCCCCC"/>
@@ -11473,7 +11473,7 @@
         <w:trPr/>
         <w:tc>
           <w:tcPr>
-            <w:tcW w:w="2799" w:type="dxa"/>
+            <w:tcW w:w="2798" w:type="dxa"/>
             <w:tcBorders>
               <w:top w:val="single" w:sz="2" w:space="0" w:color="CCCCCC"/>
               <w:left w:val="single" w:sz="2" w:space="0" w:color="CCCCCC"/>
@@ -11500,7 +11500,7 @@
         </w:tc>
         <w:tc>
           <w:tcPr>
-            <w:tcW w:w="3501" w:type="dxa"/>
+            <w:tcW w:w="3502" w:type="dxa"/>
             <w:tcBorders>
               <w:top w:val="single" w:sz="2" w:space="0" w:color="CCCCCC"/>
               <w:left w:val="single" w:sz="2" w:space="0" w:color="CCCCCC"/>
@@ -11557,7 +11557,7 @@
         <w:trPr/>
         <w:tc>
           <w:tcPr>
-            <w:tcW w:w="2799" w:type="dxa"/>
+            <w:tcW w:w="2798" w:type="dxa"/>
             <w:tcBorders>
               <w:top w:val="single" w:sz="2" w:space="0" w:color="CCCCCC"/>
               <w:left w:val="single" w:sz="2" w:space="0" w:color="CCCCCC"/>
@@ -11584,7 +11584,7 @@
         </w:tc>
         <w:tc>
           <w:tcPr>
-            <w:tcW w:w="3501" w:type="dxa"/>
+            <w:tcW w:w="3502" w:type="dxa"/>
             <w:tcBorders>
               <w:top w:val="single" w:sz="2" w:space="0" w:color="CCCCCC"/>
               <w:left w:val="single" w:sz="2" w:space="0" w:color="CCCCCC"/>
@@ -11641,7 +11641,7 @@
         <w:trPr/>
         <w:tc>
           <w:tcPr>
-            <w:tcW w:w="2799" w:type="dxa"/>
+            <w:tcW w:w="2798" w:type="dxa"/>
             <w:tcBorders>
               <w:top w:val="single" w:sz="2" w:space="0" w:color="CCCCCC"/>
               <w:left w:val="single" w:sz="2" w:space="0" w:color="CCCCCC"/>
@@ -11668,7 +11668,7 @@
         </w:tc>
         <w:tc>
           <w:tcPr>
-            <w:tcW w:w="3501" w:type="dxa"/>
+            <w:tcW w:w="3502" w:type="dxa"/>
             <w:tcBorders>
               <w:top w:val="single" w:sz="2" w:space="0" w:color="CCCCCC"/>
               <w:left w:val="single" w:sz="2" w:space="0" w:color="CCCCCC"/>
@@ -11725,7 +11725,7 @@
         <w:trPr/>
         <w:tc>
           <w:tcPr>
-            <w:tcW w:w="2799" w:type="dxa"/>
+            <w:tcW w:w="2798" w:type="dxa"/>
             <w:tcBorders>
               <w:top w:val="single" w:sz="2" w:space="0" w:color="CCCCCC"/>
               <w:left w:val="single" w:sz="2" w:space="0" w:color="CCCCCC"/>
@@ -11752,7 +11752,7 @@
         </w:tc>
         <w:tc>
           <w:tcPr>
-            <w:tcW w:w="3501" w:type="dxa"/>
+            <w:tcW w:w="3502" w:type="dxa"/>
             <w:tcBorders>
               <w:top w:val="single" w:sz="2" w:space="0" w:color="CCCCCC"/>
               <w:left w:val="single" w:sz="2" w:space="0" w:color="CCCCCC"/>
@@ -11809,7 +11809,7 @@
         <w:trPr/>
         <w:tc>
           <w:tcPr>
-            <w:tcW w:w="2799" w:type="dxa"/>
+            <w:tcW w:w="2798" w:type="dxa"/>
             <w:tcBorders>
               <w:top w:val="single" w:sz="2" w:space="0" w:color="CCCCCC"/>
               <w:left w:val="single" w:sz="2" w:space="0" w:color="CCCCCC"/>
@@ -11836,7 +11836,7 @@
         </w:tc>
         <w:tc>
           <w:tcPr>
-            <w:tcW w:w="3501" w:type="dxa"/>
+            <w:tcW w:w="3502" w:type="dxa"/>
             <w:tcBorders>
               <w:top w:val="single" w:sz="2" w:space="0" w:color="CCCCCC"/>
               <w:left w:val="single" w:sz="2" w:space="0" w:color="CCCCCC"/>
@@ -11893,7 +11893,7 @@
         <w:trPr/>
         <w:tc>
           <w:tcPr>
-            <w:tcW w:w="2799" w:type="dxa"/>
+            <w:tcW w:w="2798" w:type="dxa"/>
             <w:tcBorders>
               <w:top w:val="single" w:sz="2" w:space="0" w:color="CCCCCC"/>
               <w:left w:val="single" w:sz="2" w:space="0" w:color="CCCCCC"/>
@@ -11920,7 +11920,7 @@
         </w:tc>
         <w:tc>
           <w:tcPr>
-            <w:tcW w:w="3501" w:type="dxa"/>
+            <w:tcW w:w="3502" w:type="dxa"/>
             <w:tcBorders>
               <w:top w:val="single" w:sz="2" w:space="0" w:color="CCCCCC"/>
               <w:left w:val="single" w:sz="2" w:space="0" w:color="CCCCCC"/>
@@ -11977,7 +11977,7 @@
         <w:trPr/>
         <w:tc>
           <w:tcPr>
-            <w:tcW w:w="2799" w:type="dxa"/>
+            <w:tcW w:w="2798" w:type="dxa"/>
             <w:tcBorders>
               <w:top w:val="single" w:sz="2" w:space="0" w:color="CCCCCC"/>
               <w:left w:val="single" w:sz="2" w:space="0" w:color="CCCCCC"/>
@@ -12004,7 +12004,7 @@
         </w:tc>
         <w:tc>
           <w:tcPr>
-            <w:tcW w:w="3501" w:type="dxa"/>
+            <w:tcW w:w="3502" w:type="dxa"/>
             <w:tcBorders>
               <w:top w:val="single" w:sz="2" w:space="0" w:color="CCCCCC"/>
               <w:left w:val="single" w:sz="2" w:space="0" w:color="CCCCCC"/>
@@ -12061,7 +12061,7 @@
         <w:trPr/>
         <w:tc>
           <w:tcPr>
-            <w:tcW w:w="2799" w:type="dxa"/>
+            <w:tcW w:w="2798" w:type="dxa"/>
             <w:tcBorders>
               <w:top w:val="single" w:sz="2" w:space="0" w:color="CCCCCC"/>
               <w:left w:val="single" w:sz="2" w:space="0" w:color="CCCCCC"/>
@@ -12088,7 +12088,7 @@
         </w:tc>
         <w:tc>
           <w:tcPr>
-            <w:tcW w:w="3501" w:type="dxa"/>
+            <w:tcW w:w="3502" w:type="dxa"/>
             <w:tcBorders>
               <w:top w:val="single" w:sz="2" w:space="0" w:color="CCCCCC"/>
               <w:left w:val="single" w:sz="2" w:space="0" w:color="CCCCCC"/>
@@ -12175,7 +12175,7 @@
         <w:pStyle w:val="ListParagraph"/>
         <w:numPr>
           <w:ilvl w:val="0"/>
-          <w:numId w:val="1"/>
+          <w:numId w:val="96"/>
         </w:numPr>
         <w:spacing w:before="60" w:after="60"/>
         <w:rPr/>
@@ -12195,7 +12195,7 @@
         <w:pStyle w:val="ListParagraph"/>
         <w:numPr>
           <w:ilvl w:val="0"/>
-          <w:numId w:val="1"/>
+          <w:numId w:val="97"/>
         </w:numPr>
         <w:spacing w:before="60" w:after="60"/>
         <w:rPr/>
@@ -12215,7 +12215,7 @@
         <w:pStyle w:val="ListParagraph"/>
         <w:numPr>
           <w:ilvl w:val="0"/>
-          <w:numId w:val="1"/>
+          <w:numId w:val="98"/>
         </w:numPr>
         <w:spacing w:before="60" w:after="60"/>
         <w:rPr/>
@@ -12235,7 +12235,7 @@
         <w:pStyle w:val="ListParagraph"/>
         <w:numPr>
           <w:ilvl w:val="0"/>
-          <w:numId w:val="1"/>
+          <w:numId w:val="99"/>
         </w:numPr>
         <w:spacing w:before="60" w:after="60"/>
         <w:rPr/>
@@ -12255,7 +12255,7 @@
         <w:pStyle w:val="ListParagraph"/>
         <w:numPr>
           <w:ilvl w:val="0"/>
-          <w:numId w:val="1"/>
+          <w:numId w:val="100"/>
         </w:numPr>
         <w:spacing w:before="60" w:after="60"/>
         <w:rPr/>
@@ -12399,15 +12399,15 @@
         </w:tblCellMar>
       </w:tblPr>
       <w:tblGrid>
-        <w:gridCol w:w="2199"/>
-        <w:gridCol w:w="4601"/>
+        <w:gridCol w:w="2198"/>
+        <w:gridCol w:w="4602"/>
         <w:gridCol w:w="2226"/>
       </w:tblGrid>
       <w:tr>
         <w:trPr/>
         <w:tc>
           <w:tcPr>
-            <w:tcW w:w="2199" w:type="dxa"/>
+            <w:tcW w:w="2198" w:type="dxa"/>
             <w:tcBorders>
               <w:top w:val="single" w:sz="2" w:space="0" w:color="CCCCCC"/>
               <w:left w:val="single" w:sz="2" w:space="0" w:color="CCCCCC"/>
@@ -12436,7 +12436,7 @@
         </w:tc>
         <w:tc>
           <w:tcPr>
-            <w:tcW w:w="4601" w:type="dxa"/>
+            <w:tcW w:w="4602" w:type="dxa"/>
             <w:tcBorders>
               <w:top w:val="single" w:sz="2" w:space="0" w:color="CCCCCC"/>
               <w:left w:val="single" w:sz="2" w:space="0" w:color="CCCCCC"/>
@@ -12497,7 +12497,7 @@
         <w:trPr/>
         <w:tc>
           <w:tcPr>
-            <w:tcW w:w="2199" w:type="dxa"/>
+            <w:tcW w:w="2198" w:type="dxa"/>
             <w:tcBorders>
               <w:top w:val="single" w:sz="2" w:space="0" w:color="CCCCCC"/>
               <w:left w:val="single" w:sz="2" w:space="0" w:color="CCCCCC"/>
@@ -12524,7 +12524,7 @@
         </w:tc>
         <w:tc>
           <w:tcPr>
-            <w:tcW w:w="4601" w:type="dxa"/>
+            <w:tcW w:w="4602" w:type="dxa"/>
             <w:tcBorders>
               <w:top w:val="single" w:sz="2" w:space="0" w:color="CCCCCC"/>
               <w:left w:val="single" w:sz="2" w:space="0" w:color="CCCCCC"/>
@@ -12581,7 +12581,7 @@
         <w:trPr/>
         <w:tc>
           <w:tcPr>
-            <w:tcW w:w="2199" w:type="dxa"/>
+            <w:tcW w:w="2198" w:type="dxa"/>
             <w:tcBorders>
               <w:top w:val="single" w:sz="2" w:space="0" w:color="CCCCCC"/>
               <w:left w:val="single" w:sz="2" w:space="0" w:color="CCCCCC"/>
@@ -12608,7 +12608,7 @@
         </w:tc>
         <w:tc>
           <w:tcPr>
-            <w:tcW w:w="4601" w:type="dxa"/>
+            <w:tcW w:w="4602" w:type="dxa"/>
             <w:tcBorders>
               <w:top w:val="single" w:sz="2" w:space="0" w:color="CCCCCC"/>
               <w:left w:val="single" w:sz="2" w:space="0" w:color="CCCCCC"/>
@@ -12665,7 +12665,7 @@
         <w:trPr/>
         <w:tc>
           <w:tcPr>
-            <w:tcW w:w="2199" w:type="dxa"/>
+            <w:tcW w:w="2198" w:type="dxa"/>
             <w:tcBorders>
               <w:top w:val="single" w:sz="2" w:space="0" w:color="CCCCCC"/>
               <w:left w:val="single" w:sz="2" w:space="0" w:color="CCCCCC"/>
@@ -12692,7 +12692,7 @@
         </w:tc>
         <w:tc>
           <w:tcPr>
-            <w:tcW w:w="4601" w:type="dxa"/>
+            <w:tcW w:w="4602" w:type="dxa"/>
             <w:tcBorders>
               <w:top w:val="single" w:sz="2" w:space="0" w:color="CCCCCC"/>
               <w:left w:val="single" w:sz="2" w:space="0" w:color="CCCCCC"/>
@@ -12749,7 +12749,7 @@
         <w:trPr/>
         <w:tc>
           <w:tcPr>
-            <w:tcW w:w="2199" w:type="dxa"/>
+            <w:tcW w:w="2198" w:type="dxa"/>
             <w:tcBorders>
               <w:top w:val="single" w:sz="2" w:space="0" w:color="CCCCCC"/>
               <w:left w:val="single" w:sz="2" w:space="0" w:color="CCCCCC"/>
@@ -12776,7 +12776,7 @@
         </w:tc>
         <w:tc>
           <w:tcPr>
-            <w:tcW w:w="4601" w:type="dxa"/>
+            <w:tcW w:w="4602" w:type="dxa"/>
             <w:tcBorders>
               <w:top w:val="single" w:sz="2" w:space="0" w:color="CCCCCC"/>
               <w:left w:val="single" w:sz="2" w:space="0" w:color="CCCCCC"/>
@@ -12833,7 +12833,7 @@
         <w:trPr/>
         <w:tc>
           <w:tcPr>
-            <w:tcW w:w="2199" w:type="dxa"/>
+            <w:tcW w:w="2198" w:type="dxa"/>
             <w:tcBorders>
               <w:top w:val="single" w:sz="2" w:space="0" w:color="CCCCCC"/>
               <w:left w:val="single" w:sz="2" w:space="0" w:color="CCCCCC"/>
@@ -12860,7 +12860,7 @@
         </w:tc>
         <w:tc>
           <w:tcPr>
-            <w:tcW w:w="4601" w:type="dxa"/>
+            <w:tcW w:w="4602" w:type="dxa"/>
             <w:tcBorders>
               <w:top w:val="single" w:sz="2" w:space="0" w:color="CCCCCC"/>
               <w:left w:val="single" w:sz="2" w:space="0" w:color="CCCCCC"/>
@@ -12917,7 +12917,7 @@
         <w:trPr/>
         <w:tc>
           <w:tcPr>
-            <w:tcW w:w="2199" w:type="dxa"/>
+            <w:tcW w:w="2198" w:type="dxa"/>
             <w:tcBorders>
               <w:top w:val="single" w:sz="2" w:space="0" w:color="CCCCCC"/>
               <w:left w:val="single" w:sz="2" w:space="0" w:color="CCCCCC"/>
@@ -12944,7 +12944,7 @@
         </w:tc>
         <w:tc>
           <w:tcPr>
-            <w:tcW w:w="4601" w:type="dxa"/>
+            <w:tcW w:w="4602" w:type="dxa"/>
             <w:tcBorders>
               <w:top w:val="single" w:sz="2" w:space="0" w:color="CCCCCC"/>
               <w:left w:val="single" w:sz="2" w:space="0" w:color="CCCCCC"/>
@@ -13001,7 +13001,7 @@
         <w:trPr/>
         <w:tc>
           <w:tcPr>
-            <w:tcW w:w="2199" w:type="dxa"/>
+            <w:tcW w:w="2198" w:type="dxa"/>
             <w:tcBorders>
               <w:top w:val="single" w:sz="2" w:space="0" w:color="CCCCCC"/>
               <w:left w:val="single" w:sz="2" w:space="0" w:color="CCCCCC"/>
@@ -13028,7 +13028,7 @@
         </w:tc>
         <w:tc>
           <w:tcPr>
-            <w:tcW w:w="4601" w:type="dxa"/>
+            <w:tcW w:w="4602" w:type="dxa"/>
             <w:tcBorders>
               <w:top w:val="single" w:sz="2" w:space="0" w:color="CCCCCC"/>
               <w:left w:val="single" w:sz="2" w:space="0" w:color="CCCCCC"/>
@@ -13085,7 +13085,7 @@
         <w:trPr/>
         <w:tc>
           <w:tcPr>
-            <w:tcW w:w="2199" w:type="dxa"/>
+            <w:tcW w:w="2198" w:type="dxa"/>
             <w:tcBorders>
               <w:top w:val="single" w:sz="2" w:space="0" w:color="CCCCCC"/>
               <w:left w:val="single" w:sz="2" w:space="0" w:color="CCCCCC"/>
@@ -13112,7 +13112,7 @@
         </w:tc>
         <w:tc>
           <w:tcPr>
-            <w:tcW w:w="4601" w:type="dxa"/>
+            <w:tcW w:w="4602" w:type="dxa"/>
             <w:tcBorders>
               <w:top w:val="single" w:sz="2" w:space="0" w:color="CCCCCC"/>
               <w:left w:val="single" w:sz="2" w:space="0" w:color="CCCCCC"/>
@@ -13169,7 +13169,7 @@
         <w:trPr/>
         <w:tc>
           <w:tcPr>
-            <w:tcW w:w="2199" w:type="dxa"/>
+            <w:tcW w:w="2198" w:type="dxa"/>
             <w:tcBorders>
               <w:top w:val="single" w:sz="2" w:space="0" w:color="CCCCCC"/>
               <w:left w:val="single" w:sz="2" w:space="0" w:color="CCCCCC"/>
@@ -13196,7 +13196,7 @@
         </w:tc>
         <w:tc>
           <w:tcPr>
-            <w:tcW w:w="4601" w:type="dxa"/>
+            <w:tcW w:w="4602" w:type="dxa"/>
             <w:tcBorders>
               <w:top w:val="single" w:sz="2" w:space="0" w:color="CCCCCC"/>
               <w:left w:val="single" w:sz="2" w:space="0" w:color="CCCCCC"/>
@@ -13283,7 +13283,7 @@
         <w:pStyle w:val="ListParagraph"/>
         <w:numPr>
           <w:ilvl w:val="0"/>
-          <w:numId w:val="1"/>
+          <w:numId w:val="101"/>
         </w:numPr>
         <w:spacing w:before="60" w:after="60"/>
         <w:rPr/>
@@ -13303,7 +13303,7 @@
         <w:pStyle w:val="ListParagraph"/>
         <w:numPr>
           <w:ilvl w:val="0"/>
-          <w:numId w:val="1"/>
+          <w:numId w:val="102"/>
         </w:numPr>
         <w:spacing w:before="60" w:after="60"/>
         <w:rPr/>
@@ -13323,7 +13323,7 @@
         <w:pStyle w:val="ListParagraph"/>
         <w:numPr>
           <w:ilvl w:val="0"/>
-          <w:numId w:val="1"/>
+          <w:numId w:val="103"/>
         </w:numPr>
         <w:spacing w:before="60" w:after="60"/>
         <w:rPr/>
@@ -13343,7 +13343,7 @@
         <w:pStyle w:val="ListParagraph"/>
         <w:numPr>
           <w:ilvl w:val="0"/>
-          <w:numId w:val="1"/>
+          <w:numId w:val="104"/>
         </w:numPr>
         <w:spacing w:before="60" w:after="60"/>
         <w:rPr/>
@@ -13363,7 +13363,7 @@
         <w:pStyle w:val="ListParagraph"/>
         <w:numPr>
           <w:ilvl w:val="0"/>
-          <w:numId w:val="1"/>
+          <w:numId w:val="105"/>
         </w:numPr>
         <w:spacing w:before="60" w:after="60"/>
         <w:rPr/>
@@ -13383,7 +13383,7 @@
         <w:pStyle w:val="ListParagraph"/>
         <w:numPr>
           <w:ilvl w:val="0"/>
-          <w:numId w:val="1"/>
+          <w:numId w:val="106"/>
         </w:numPr>
         <w:spacing w:before="60" w:after="60"/>
         <w:rPr/>
@@ -13440,14 +13440,14 @@
         </w:tblCellMar>
       </w:tblPr>
       <w:tblGrid>
-        <w:gridCol w:w="2799"/>
-        <w:gridCol w:w="6226"/>
+        <w:gridCol w:w="2798"/>
+        <w:gridCol w:w="6227"/>
       </w:tblGrid>
       <w:tr>
         <w:trPr/>
         <w:tc>
           <w:tcPr>
-            <w:tcW w:w="2799" w:type="dxa"/>
+            <w:tcW w:w="2798" w:type="dxa"/>
             <w:tcBorders>
               <w:top w:val="single" w:sz="2" w:space="0" w:color="CCCCCC"/>
               <w:left w:val="single" w:sz="2" w:space="0" w:color="CCCCCC"/>
@@ -13476,7 +13476,7 @@
         </w:tc>
         <w:tc>
           <w:tcPr>
-            <w:tcW w:w="6226" w:type="dxa"/>
+            <w:tcW w:w="6227" w:type="dxa"/>
             <w:tcBorders>
               <w:top w:val="single" w:sz="2" w:space="0" w:color="CCCCCC"/>
               <w:left w:val="single" w:sz="2" w:space="0" w:color="CCCCCC"/>
@@ -13506,7 +13506,7 @@
         <w:trPr/>
         <w:tc>
           <w:tcPr>
-            <w:tcW w:w="2799" w:type="dxa"/>
+            <w:tcW w:w="2798" w:type="dxa"/>
             <w:tcBorders>
               <w:top w:val="single" w:sz="2" w:space="0" w:color="CCCCCC"/>
               <w:left w:val="single" w:sz="2" w:space="0" w:color="CCCCCC"/>
@@ -13535,7 +13535,7 @@
         </w:tc>
         <w:tc>
           <w:tcPr>
-            <w:tcW w:w="6226" w:type="dxa"/>
+            <w:tcW w:w="6227" w:type="dxa"/>
             <w:tcBorders>
               <w:top w:val="single" w:sz="2" w:space="0" w:color="CCCCCC"/>
               <w:left w:val="single" w:sz="2" w:space="0" w:color="CCCCCC"/>
@@ -13565,7 +13565,7 @@
         <w:trPr/>
         <w:tc>
           <w:tcPr>
-            <w:tcW w:w="2799" w:type="dxa"/>
+            <w:tcW w:w="2798" w:type="dxa"/>
             <w:tcBorders>
               <w:top w:val="single" w:sz="2" w:space="0" w:color="CCCCCC"/>
               <w:left w:val="single" w:sz="2" w:space="0" w:color="CCCCCC"/>
@@ -13594,7 +13594,7 @@
         </w:tc>
         <w:tc>
           <w:tcPr>
-            <w:tcW w:w="6226" w:type="dxa"/>
+            <w:tcW w:w="6227" w:type="dxa"/>
             <w:tcBorders>
               <w:top w:val="single" w:sz="2" w:space="0" w:color="CCCCCC"/>
               <w:left w:val="single" w:sz="2" w:space="0" w:color="CCCCCC"/>
@@ -13624,7 +13624,7 @@
         <w:trPr/>
         <w:tc>
           <w:tcPr>
-            <w:tcW w:w="2799" w:type="dxa"/>
+            <w:tcW w:w="2798" w:type="dxa"/>
             <w:tcBorders>
               <w:top w:val="single" w:sz="2" w:space="0" w:color="CCCCCC"/>
               <w:left w:val="single" w:sz="2" w:space="0" w:color="CCCCCC"/>
@@ -13653,7 +13653,7 @@
         </w:tc>
         <w:tc>
           <w:tcPr>
-            <w:tcW w:w="6226" w:type="dxa"/>
+            <w:tcW w:w="6227" w:type="dxa"/>
             <w:tcBorders>
               <w:top w:val="single" w:sz="2" w:space="0" w:color="CCCCCC"/>
               <w:left w:val="single" w:sz="2" w:space="0" w:color="CCCCCC"/>
@@ -13683,7 +13683,7 @@
         <w:trPr/>
         <w:tc>
           <w:tcPr>
-            <w:tcW w:w="2799" w:type="dxa"/>
+            <w:tcW w:w="2798" w:type="dxa"/>
             <w:tcBorders>
               <w:top w:val="single" w:sz="2" w:space="0" w:color="CCCCCC"/>
               <w:left w:val="single" w:sz="2" w:space="0" w:color="CCCCCC"/>
@@ -13712,7 +13712,7 @@
         </w:tc>
         <w:tc>
           <w:tcPr>
-            <w:tcW w:w="6226" w:type="dxa"/>
+            <w:tcW w:w="6227" w:type="dxa"/>
             <w:tcBorders>
               <w:top w:val="single" w:sz="2" w:space="0" w:color="CCCCCC"/>
               <w:left w:val="single" w:sz="2" w:space="0" w:color="CCCCCC"/>
@@ -13742,7 +13742,7 @@
         <w:trPr/>
         <w:tc>
           <w:tcPr>
-            <w:tcW w:w="2799" w:type="dxa"/>
+            <w:tcW w:w="2798" w:type="dxa"/>
             <w:tcBorders>
               <w:top w:val="single" w:sz="2" w:space="0" w:color="CCCCCC"/>
               <w:left w:val="single" w:sz="2" w:space="0" w:color="CCCCCC"/>
@@ -13771,7 +13771,7 @@
         </w:tc>
         <w:tc>
           <w:tcPr>
-            <w:tcW w:w="6226" w:type="dxa"/>
+            <w:tcW w:w="6227" w:type="dxa"/>
             <w:tcBorders>
               <w:top w:val="single" w:sz="2" w:space="0" w:color="CCCCCC"/>
               <w:left w:val="single" w:sz="2" w:space="0" w:color="CCCCCC"/>
@@ -13801,7 +13801,7 @@
         <w:trPr/>
         <w:tc>
           <w:tcPr>
-            <w:tcW w:w="2799" w:type="dxa"/>
+            <w:tcW w:w="2798" w:type="dxa"/>
             <w:tcBorders>
               <w:top w:val="single" w:sz="2" w:space="0" w:color="CCCCCC"/>
               <w:left w:val="single" w:sz="2" w:space="0" w:color="CCCCCC"/>
@@ -13830,7 +13830,7 @@
         </w:tc>
         <w:tc>
           <w:tcPr>
-            <w:tcW w:w="6226" w:type="dxa"/>
+            <w:tcW w:w="6227" w:type="dxa"/>
             <w:tcBorders>
               <w:top w:val="single" w:sz="2" w:space="0" w:color="CCCCCC"/>
               <w:left w:val="single" w:sz="2" w:space="0" w:color="CCCCCC"/>
@@ -13959,7 +13959,7 @@
         <w:pStyle w:val="ListParagraph"/>
         <w:numPr>
           <w:ilvl w:val="0"/>
-          <w:numId w:val="1"/>
+          <w:numId w:val="107"/>
         </w:numPr>
         <w:spacing w:before="60" w:after="60"/>
         <w:rPr/>
@@ -13979,7 +13979,7 @@
         <w:pStyle w:val="ListParagraph"/>
         <w:numPr>
           <w:ilvl w:val="0"/>
-          <w:numId w:val="1"/>
+          <w:numId w:val="108"/>
         </w:numPr>
         <w:spacing w:before="60" w:after="60"/>
         <w:rPr/>
@@ -13999,7 +13999,7 @@
         <w:pStyle w:val="ListParagraph"/>
         <w:numPr>
           <w:ilvl w:val="0"/>
-          <w:numId w:val="1"/>
+          <w:numId w:val="109"/>
         </w:numPr>
         <w:spacing w:before="60" w:after="60"/>
         <w:rPr/>
@@ -14019,7 +14019,7 @@
         <w:pStyle w:val="ListParagraph"/>
         <w:numPr>
           <w:ilvl w:val="0"/>
-          <w:numId w:val="1"/>
+          <w:numId w:val="110"/>
         </w:numPr>
         <w:spacing w:before="60" w:after="60"/>
         <w:rPr/>
@@ -14039,7 +14039,7 @@
         <w:pStyle w:val="ListParagraph"/>
         <w:numPr>
           <w:ilvl w:val="0"/>
-          <w:numId w:val="1"/>
+          <w:numId w:val="111"/>
         </w:numPr>
         <w:spacing w:before="60" w:after="60"/>
         <w:rPr/>
@@ -14059,7 +14059,7 @@
         <w:pStyle w:val="ListParagraph"/>
         <w:numPr>
           <w:ilvl w:val="0"/>
-          <w:numId w:val="1"/>
+          <w:numId w:val="112"/>
         </w:numPr>
         <w:spacing w:before="60" w:after="60"/>
         <w:rPr/>
@@ -14079,7 +14079,7 @@
         <w:pStyle w:val="ListParagraph"/>
         <w:numPr>
           <w:ilvl w:val="0"/>
-          <w:numId w:val="1"/>
+          <w:numId w:val="113"/>
         </w:numPr>
         <w:spacing w:before="60" w:after="60"/>
         <w:rPr/>
@@ -14099,7 +14099,7 @@
         <w:pStyle w:val="ListParagraph"/>
         <w:numPr>
           <w:ilvl w:val="0"/>
-          <w:numId w:val="1"/>
+          <w:numId w:val="114"/>
         </w:numPr>
         <w:spacing w:before="60" w:after="60"/>
         <w:rPr/>
@@ -14183,7 +14183,7 @@
         <w:pStyle w:val="ListParagraph"/>
         <w:numPr>
           <w:ilvl w:val="0"/>
-          <w:numId w:val="1"/>
+          <w:numId w:val="115"/>
         </w:numPr>
         <w:spacing w:before="60" w:after="60"/>
         <w:rPr/>
@@ -14203,7 +14203,7 @@
         <w:pStyle w:val="ListParagraph"/>
         <w:numPr>
           <w:ilvl w:val="0"/>
-          <w:numId w:val="1"/>
+          <w:numId w:val="116"/>
         </w:numPr>
         <w:spacing w:before="60" w:after="60"/>
         <w:rPr/>
@@ -14223,7 +14223,7 @@
         <w:pStyle w:val="ListParagraph"/>
         <w:numPr>
           <w:ilvl w:val="0"/>
-          <w:numId w:val="1"/>
+          <w:numId w:val="117"/>
         </w:numPr>
         <w:spacing w:before="60" w:after="60"/>
         <w:rPr/>
@@ -14243,7 +14243,7 @@
         <w:pStyle w:val="ListParagraph"/>
         <w:numPr>
           <w:ilvl w:val="0"/>
-          <w:numId w:val="1"/>
+          <w:numId w:val="118"/>
         </w:numPr>
         <w:spacing w:before="60" w:after="60"/>
         <w:rPr/>
@@ -14263,7 +14263,7 @@
         <w:pStyle w:val="ListParagraph"/>
         <w:numPr>
           <w:ilvl w:val="0"/>
-          <w:numId w:val="1"/>
+          <w:numId w:val="119"/>
         </w:numPr>
         <w:spacing w:before="60" w:after="60"/>
         <w:rPr/>
@@ -14283,7 +14283,7 @@
         <w:pStyle w:val="ListParagraph"/>
         <w:numPr>
           <w:ilvl w:val="0"/>
-          <w:numId w:val="1"/>
+          <w:numId w:val="120"/>
         </w:numPr>
         <w:spacing w:before="60" w:after="60"/>
         <w:rPr/>
@@ -14367,7 +14367,7 @@
         <w:pStyle w:val="ListParagraph"/>
         <w:numPr>
           <w:ilvl w:val="0"/>
-          <w:numId w:val="1"/>
+          <w:numId w:val="121"/>
         </w:numPr>
         <w:spacing w:before="60" w:after="60"/>
         <w:rPr/>
@@ -14387,7 +14387,7 @@
         <w:pStyle w:val="ListParagraph"/>
         <w:numPr>
           <w:ilvl w:val="0"/>
-          <w:numId w:val="1"/>
+          <w:numId w:val="122"/>
         </w:numPr>
         <w:spacing w:before="60" w:after="60"/>
         <w:rPr/>
@@ -14407,7 +14407,7 @@
         <w:pStyle w:val="ListParagraph"/>
         <w:numPr>
           <w:ilvl w:val="0"/>
-          <w:numId w:val="1"/>
+          <w:numId w:val="123"/>
         </w:numPr>
         <w:spacing w:before="60" w:after="60"/>
         <w:rPr/>
@@ -14427,7 +14427,7 @@
         <w:pStyle w:val="ListParagraph"/>
         <w:numPr>
           <w:ilvl w:val="0"/>
-          <w:numId w:val="1"/>
+          <w:numId w:val="124"/>
         </w:numPr>
         <w:spacing w:before="60" w:after="60"/>
         <w:rPr/>
@@ -14447,7 +14447,7 @@
         <w:pStyle w:val="ListParagraph"/>
         <w:numPr>
           <w:ilvl w:val="0"/>
-          <w:numId w:val="1"/>
+          <w:numId w:val="125"/>
         </w:numPr>
         <w:spacing w:before="60" w:after="60"/>
         <w:rPr/>
@@ -14467,7 +14467,7 @@
         <w:pStyle w:val="ListParagraph"/>
         <w:numPr>
           <w:ilvl w:val="0"/>
-          <w:numId w:val="1"/>
+          <w:numId w:val="126"/>
         </w:numPr>
         <w:spacing w:before="60" w:after="60"/>
         <w:rPr/>
@@ -15525,7 +15525,7 @@
         <w:pStyle w:val="ListParagraph"/>
         <w:numPr>
           <w:ilvl w:val="0"/>
-          <w:numId w:val="1"/>
+          <w:numId w:val="127"/>
         </w:numPr>
         <w:spacing w:before="60" w:after="60"/>
         <w:rPr/>
@@ -15545,7 +15545,7 @@
         <w:pStyle w:val="ListParagraph"/>
         <w:numPr>
           <w:ilvl w:val="0"/>
-          <w:numId w:val="1"/>
+          <w:numId w:val="128"/>
         </w:numPr>
         <w:spacing w:before="60" w:after="60"/>
         <w:rPr/>
@@ -15565,7 +15565,7 @@
         <w:pStyle w:val="ListParagraph"/>
         <w:numPr>
           <w:ilvl w:val="0"/>
-          <w:numId w:val="1"/>
+          <w:numId w:val="129"/>
         </w:numPr>
         <w:spacing w:before="60" w:after="60"/>
         <w:rPr/>
@@ -15585,7 +15585,7 @@
         <w:pStyle w:val="ListParagraph"/>
         <w:numPr>
           <w:ilvl w:val="0"/>
-          <w:numId w:val="1"/>
+          <w:numId w:val="130"/>
         </w:numPr>
         <w:spacing w:before="60" w:after="60"/>
         <w:rPr/>
@@ -15605,7 +15605,7 @@
         <w:pStyle w:val="ListParagraph"/>
         <w:numPr>
           <w:ilvl w:val="0"/>
-          <w:numId w:val="1"/>
+          <w:numId w:val="131"/>
         </w:numPr>
         <w:spacing w:before="60" w:after="60"/>
         <w:rPr/>
@@ -15662,15 +15662,15 @@
         </w:tblCellMar>
       </w:tblPr>
       <w:tblGrid>
-        <w:gridCol w:w="3599"/>
-        <w:gridCol w:w="2600"/>
+        <w:gridCol w:w="3598"/>
+        <w:gridCol w:w="2601"/>
         <w:gridCol w:w="2827"/>
       </w:tblGrid>
       <w:tr>
         <w:trPr/>
         <w:tc>
           <w:tcPr>
-            <w:tcW w:w="3599" w:type="dxa"/>
+            <w:tcW w:w="3598" w:type="dxa"/>
             <w:tcBorders>
               <w:top w:val="single" w:sz="2" w:space="0" w:color="CCCCCC"/>
               <w:left w:val="single" w:sz="2" w:space="0" w:color="CCCCCC"/>
@@ -15699,7 +15699,7 @@
         </w:tc>
         <w:tc>
           <w:tcPr>
-            <w:tcW w:w="2600" w:type="dxa"/>
+            <w:tcW w:w="2601" w:type="dxa"/>
             <w:tcBorders>
               <w:top w:val="single" w:sz="2" w:space="0" w:color="CCCCCC"/>
               <w:left w:val="single" w:sz="2" w:space="0" w:color="CCCCCC"/>
@@ -15760,7 +15760,7 @@
         <w:trPr/>
         <w:tc>
           <w:tcPr>
-            <w:tcW w:w="3599" w:type="dxa"/>
+            <w:tcW w:w="3598" w:type="dxa"/>
             <w:tcBorders>
               <w:top w:val="single" w:sz="2" w:space="0" w:color="CCCCCC"/>
               <w:left w:val="single" w:sz="2" w:space="0" w:color="CCCCCC"/>
@@ -15787,7 +15787,7 @@
         </w:tc>
         <w:tc>
           <w:tcPr>
-            <w:tcW w:w="2600" w:type="dxa"/>
+            <w:tcW w:w="2601" w:type="dxa"/>
             <w:tcBorders>
               <w:top w:val="single" w:sz="2" w:space="0" w:color="CCCCCC"/>
               <w:left w:val="single" w:sz="2" w:space="0" w:color="CCCCCC"/>
@@ -15844,7 +15844,7 @@
         <w:trPr/>
         <w:tc>
           <w:tcPr>
-            <w:tcW w:w="3599" w:type="dxa"/>
+            <w:tcW w:w="3598" w:type="dxa"/>
             <w:tcBorders>
               <w:top w:val="single" w:sz="2" w:space="0" w:color="CCCCCC"/>
               <w:left w:val="single" w:sz="2" w:space="0" w:color="CCCCCC"/>
@@ -15871,7 +15871,7 @@
         </w:tc>
         <w:tc>
           <w:tcPr>
-            <w:tcW w:w="2600" w:type="dxa"/>
+            <w:tcW w:w="2601" w:type="dxa"/>
             <w:tcBorders>
               <w:top w:val="single" w:sz="2" w:space="0" w:color="CCCCCC"/>
               <w:left w:val="single" w:sz="2" w:space="0" w:color="CCCCCC"/>
@@ -15928,7 +15928,7 @@
         <w:trPr/>
         <w:tc>
           <w:tcPr>
-            <w:tcW w:w="3599" w:type="dxa"/>
+            <w:tcW w:w="3598" w:type="dxa"/>
             <w:tcBorders>
               <w:top w:val="single" w:sz="2" w:space="0" w:color="CCCCCC"/>
               <w:left w:val="single" w:sz="2" w:space="0" w:color="CCCCCC"/>
@@ -15955,7 +15955,7 @@
         </w:tc>
         <w:tc>
           <w:tcPr>
-            <w:tcW w:w="2600" w:type="dxa"/>
+            <w:tcW w:w="2601" w:type="dxa"/>
             <w:tcBorders>
               <w:top w:val="single" w:sz="2" w:space="0" w:color="CCCCCC"/>
               <w:left w:val="single" w:sz="2" w:space="0" w:color="CCCCCC"/>
@@ -16012,7 +16012,7 @@
         <w:trPr/>
         <w:tc>
           <w:tcPr>
-            <w:tcW w:w="3599" w:type="dxa"/>
+            <w:tcW w:w="3598" w:type="dxa"/>
             <w:tcBorders>
               <w:top w:val="single" w:sz="2" w:space="0" w:color="CCCCCC"/>
               <w:left w:val="single" w:sz="2" w:space="0" w:color="CCCCCC"/>
@@ -16039,7 +16039,7 @@
         </w:tc>
         <w:tc>
           <w:tcPr>
-            <w:tcW w:w="2600" w:type="dxa"/>
+            <w:tcW w:w="2601" w:type="dxa"/>
             <w:tcBorders>
               <w:top w:val="single" w:sz="2" w:space="0" w:color="CCCCCC"/>
               <w:left w:val="single" w:sz="2" w:space="0" w:color="CCCCCC"/>
@@ -16096,7 +16096,7 @@
         <w:trPr/>
         <w:tc>
           <w:tcPr>
-            <w:tcW w:w="3599" w:type="dxa"/>
+            <w:tcW w:w="3598" w:type="dxa"/>
             <w:tcBorders>
               <w:top w:val="single" w:sz="2" w:space="0" w:color="CCCCCC"/>
               <w:left w:val="single" w:sz="2" w:space="0" w:color="CCCCCC"/>
@@ -16123,7 +16123,7 @@
         </w:tc>
         <w:tc>
           <w:tcPr>
-            <w:tcW w:w="2600" w:type="dxa"/>
+            <w:tcW w:w="2601" w:type="dxa"/>
             <w:tcBorders>
               <w:top w:val="single" w:sz="2" w:space="0" w:color="CCCCCC"/>
               <w:left w:val="single" w:sz="2" w:space="0" w:color="CCCCCC"/>
@@ -16180,7 +16180,7 @@
         <w:trPr/>
         <w:tc>
           <w:tcPr>
-            <w:tcW w:w="3599" w:type="dxa"/>
+            <w:tcW w:w="3598" w:type="dxa"/>
             <w:tcBorders>
               <w:top w:val="single" w:sz="2" w:space="0" w:color="CCCCCC"/>
               <w:left w:val="single" w:sz="2" w:space="0" w:color="CCCCCC"/>
@@ -16207,7 +16207,7 @@
         </w:tc>
         <w:tc>
           <w:tcPr>
-            <w:tcW w:w="2600" w:type="dxa"/>
+            <w:tcW w:w="2601" w:type="dxa"/>
             <w:tcBorders>
               <w:top w:val="single" w:sz="2" w:space="0" w:color="CCCCCC"/>
               <w:left w:val="single" w:sz="2" w:space="0" w:color="CCCCCC"/>
@@ -16264,7 +16264,7 @@
         <w:trPr/>
         <w:tc>
           <w:tcPr>
-            <w:tcW w:w="3599" w:type="dxa"/>
+            <w:tcW w:w="3598" w:type="dxa"/>
             <w:tcBorders>
               <w:top w:val="single" w:sz="2" w:space="0" w:color="CCCCCC"/>
               <w:left w:val="single" w:sz="2" w:space="0" w:color="CCCCCC"/>
@@ -16291,7 +16291,7 @@
         </w:tc>
         <w:tc>
           <w:tcPr>
-            <w:tcW w:w="2600" w:type="dxa"/>
+            <w:tcW w:w="2601" w:type="dxa"/>
             <w:tcBorders>
               <w:top w:val="single" w:sz="2" w:space="0" w:color="CCCCCC"/>
               <w:left w:val="single" w:sz="2" w:space="0" w:color="CCCCCC"/>
@@ -16342,7 +16342,7 @@
         <w:trPr/>
         <w:tc>
           <w:tcPr>
-            <w:tcW w:w="3599" w:type="dxa"/>
+            <w:tcW w:w="3598" w:type="dxa"/>
             <w:tcBorders>
               <w:top w:val="single" w:sz="2" w:space="0" w:color="CCCCCC"/>
               <w:left w:val="single" w:sz="2" w:space="0" w:color="CCCCCC"/>
@@ -16369,7 +16369,7 @@
         </w:tc>
         <w:tc>
           <w:tcPr>
-            <w:tcW w:w="2600" w:type="dxa"/>
+            <w:tcW w:w="2601" w:type="dxa"/>
             <w:tcBorders>
               <w:top w:val="single" w:sz="2" w:space="0" w:color="CCCCCC"/>
               <w:left w:val="single" w:sz="2" w:space="0" w:color="CCCCCC"/>
@@ -17544,14 +17544,14 @@
         </w:tblCellMar>
       </w:tblPr>
       <w:tblGrid>
-        <w:gridCol w:w="2799"/>
-        <w:gridCol w:w="6226"/>
+        <w:gridCol w:w="2798"/>
+        <w:gridCol w:w="6227"/>
       </w:tblGrid>
       <w:tr>
         <w:trPr/>
         <w:tc>
           <w:tcPr>
-            <w:tcW w:w="2799" w:type="dxa"/>
+            <w:tcW w:w="2798" w:type="dxa"/>
             <w:tcBorders>
               <w:top w:val="single" w:sz="2" w:space="0" w:color="CCCCCC"/>
               <w:left w:val="single" w:sz="2" w:space="0" w:color="CCCCCC"/>
@@ -17580,7 +17580,7 @@
         </w:tc>
         <w:tc>
           <w:tcPr>
-            <w:tcW w:w="6226" w:type="dxa"/>
+            <w:tcW w:w="6227" w:type="dxa"/>
             <w:tcBorders>
               <w:top w:val="single" w:sz="2" w:space="0" w:color="CCCCCC"/>
               <w:left w:val="single" w:sz="2" w:space="0" w:color="CCCCCC"/>
@@ -17610,7 +17610,7 @@
         <w:trPr/>
         <w:tc>
           <w:tcPr>
-            <w:tcW w:w="2799" w:type="dxa"/>
+            <w:tcW w:w="2798" w:type="dxa"/>
             <w:tcBorders>
               <w:top w:val="single" w:sz="2" w:space="0" w:color="CCCCCC"/>
               <w:left w:val="single" w:sz="2" w:space="0" w:color="CCCCCC"/>
@@ -17639,7 +17639,7 @@
         </w:tc>
         <w:tc>
           <w:tcPr>
-            <w:tcW w:w="6226" w:type="dxa"/>
+            <w:tcW w:w="6227" w:type="dxa"/>
             <w:tcBorders>
               <w:top w:val="single" w:sz="2" w:space="0" w:color="CCCCCC"/>
               <w:left w:val="single" w:sz="2" w:space="0" w:color="CCCCCC"/>
@@ -17669,7 +17669,7 @@
         <w:trPr/>
         <w:tc>
           <w:tcPr>
-            <w:tcW w:w="2799" w:type="dxa"/>
+            <w:tcW w:w="2798" w:type="dxa"/>
             <w:tcBorders>
               <w:top w:val="single" w:sz="2" w:space="0" w:color="CCCCCC"/>
               <w:left w:val="single" w:sz="2" w:space="0" w:color="CCCCCC"/>
@@ -17698,7 +17698,7 @@
         </w:tc>
         <w:tc>
           <w:tcPr>
-            <w:tcW w:w="6226" w:type="dxa"/>
+            <w:tcW w:w="6227" w:type="dxa"/>
             <w:tcBorders>
               <w:top w:val="single" w:sz="2" w:space="0" w:color="CCCCCC"/>
               <w:left w:val="single" w:sz="2" w:space="0" w:color="CCCCCC"/>
@@ -17728,7 +17728,7 @@
         <w:trPr/>
         <w:tc>
           <w:tcPr>
-            <w:tcW w:w="2799" w:type="dxa"/>
+            <w:tcW w:w="2798" w:type="dxa"/>
             <w:tcBorders>
               <w:top w:val="single" w:sz="2" w:space="0" w:color="CCCCCC"/>
               <w:left w:val="single" w:sz="2" w:space="0" w:color="CCCCCC"/>
@@ -17757,7 +17757,7 @@
         </w:tc>
         <w:tc>
           <w:tcPr>
-            <w:tcW w:w="6226" w:type="dxa"/>
+            <w:tcW w:w="6227" w:type="dxa"/>
             <w:tcBorders>
               <w:top w:val="single" w:sz="2" w:space="0" w:color="CCCCCC"/>
               <w:left w:val="single" w:sz="2" w:space="0" w:color="CCCCCC"/>
@@ -17787,7 +17787,7 @@
         <w:trPr/>
         <w:tc>
           <w:tcPr>
-            <w:tcW w:w="2799" w:type="dxa"/>
+            <w:tcW w:w="2798" w:type="dxa"/>
             <w:tcBorders>
               <w:top w:val="single" w:sz="2" w:space="0" w:color="CCCCCC"/>
               <w:left w:val="single" w:sz="2" w:space="0" w:color="CCCCCC"/>
@@ -17816,7 +17816,7 @@
         </w:tc>
         <w:tc>
           <w:tcPr>
-            <w:tcW w:w="6226" w:type="dxa"/>
+            <w:tcW w:w="6227" w:type="dxa"/>
             <w:tcBorders>
               <w:top w:val="single" w:sz="2" w:space="0" w:color="CCCCCC"/>
               <w:left w:val="single" w:sz="2" w:space="0" w:color="CCCCCC"/>
@@ -17846,7 +17846,7 @@
         <w:trPr/>
         <w:tc>
           <w:tcPr>
-            <w:tcW w:w="2799" w:type="dxa"/>
+            <w:tcW w:w="2798" w:type="dxa"/>
             <w:tcBorders>
               <w:top w:val="single" w:sz="2" w:space="0" w:color="CCCCCC"/>
               <w:left w:val="single" w:sz="2" w:space="0" w:color="CCCCCC"/>
@@ -17875,7 +17875,7 @@
         </w:tc>
         <w:tc>
           <w:tcPr>
-            <w:tcW w:w="6226" w:type="dxa"/>
+            <w:tcW w:w="6227" w:type="dxa"/>
             <w:tcBorders>
               <w:top w:val="single" w:sz="2" w:space="0" w:color="CCCCCC"/>
               <w:left w:val="single" w:sz="2" w:space="0" w:color="CCCCCC"/>
@@ -17905,7 +17905,7 @@
         <w:trPr/>
         <w:tc>
           <w:tcPr>
-            <w:tcW w:w="2799" w:type="dxa"/>
+            <w:tcW w:w="2798" w:type="dxa"/>
             <w:tcBorders>
               <w:top w:val="single" w:sz="2" w:space="0" w:color="CCCCCC"/>
               <w:left w:val="single" w:sz="2" w:space="0" w:color="CCCCCC"/>
@@ -17934,7 +17934,7 @@
         </w:tc>
         <w:tc>
           <w:tcPr>
-            <w:tcW w:w="6226" w:type="dxa"/>
+            <w:tcW w:w="6227" w:type="dxa"/>
             <w:tcBorders>
               <w:top w:val="single" w:sz="2" w:space="0" w:color="CCCCCC"/>
               <w:left w:val="single" w:sz="2" w:space="0" w:color="CCCCCC"/>
@@ -17964,7 +17964,7 @@
         <w:trPr/>
         <w:tc>
           <w:tcPr>
-            <w:tcW w:w="2799" w:type="dxa"/>
+            <w:tcW w:w="2798" w:type="dxa"/>
             <w:tcBorders>
               <w:top w:val="single" w:sz="2" w:space="0" w:color="CCCCCC"/>
               <w:left w:val="single" w:sz="2" w:space="0" w:color="CCCCCC"/>
@@ -17993,7 +17993,7 @@
         </w:tc>
         <w:tc>
           <w:tcPr>
-            <w:tcW w:w="6226" w:type="dxa"/>
+            <w:tcW w:w="6227" w:type="dxa"/>
             <w:tcBorders>
               <w:top w:val="single" w:sz="2" w:space="0" w:color="CCCCCC"/>
               <w:left w:val="single" w:sz="2" w:space="0" w:color="CCCCCC"/>
@@ -18023,7 +18023,7 @@
         <w:trPr/>
         <w:tc>
           <w:tcPr>
-            <w:tcW w:w="2799" w:type="dxa"/>
+            <w:tcW w:w="2798" w:type="dxa"/>
             <w:tcBorders>
               <w:top w:val="single" w:sz="2" w:space="0" w:color="CCCCCC"/>
               <w:left w:val="single" w:sz="2" w:space="0" w:color="CCCCCC"/>
@@ -18052,7 +18052,7 @@
         </w:tc>
         <w:tc>
           <w:tcPr>
-            <w:tcW w:w="6226" w:type="dxa"/>
+            <w:tcW w:w="6227" w:type="dxa"/>
             <w:tcBorders>
               <w:top w:val="single" w:sz="2" w:space="0" w:color="CCCCCC"/>
               <w:left w:val="single" w:sz="2" w:space="0" w:color="CCCCCC"/>
@@ -18082,7 +18082,7 @@
         <w:trPr/>
         <w:tc>
           <w:tcPr>
-            <w:tcW w:w="2799" w:type="dxa"/>
+            <w:tcW w:w="2798" w:type="dxa"/>
             <w:tcBorders>
               <w:top w:val="single" w:sz="2" w:space="0" w:color="CCCCCC"/>
               <w:left w:val="single" w:sz="2" w:space="0" w:color="CCCCCC"/>
@@ -18111,7 +18111,7 @@
         </w:tc>
         <w:tc>
           <w:tcPr>
-            <w:tcW w:w="6226" w:type="dxa"/>
+            <w:tcW w:w="6227" w:type="dxa"/>
             <w:tcBorders>
               <w:top w:val="single" w:sz="2" w:space="0" w:color="CCCCCC"/>
               <w:left w:val="single" w:sz="2" w:space="0" w:color="CCCCCC"/>
@@ -18141,7 +18141,7 @@
         <w:trPr/>
         <w:tc>
           <w:tcPr>
-            <w:tcW w:w="2799" w:type="dxa"/>
+            <w:tcW w:w="2798" w:type="dxa"/>
             <w:tcBorders>
               <w:top w:val="single" w:sz="2" w:space="0" w:color="CCCCCC"/>
               <w:left w:val="single" w:sz="2" w:space="0" w:color="CCCCCC"/>
@@ -18170,7 +18170,7 @@
         </w:tc>
         <w:tc>
           <w:tcPr>
-            <w:tcW w:w="6226" w:type="dxa"/>
+            <w:tcW w:w="6227" w:type="dxa"/>
             <w:tcBorders>
               <w:top w:val="single" w:sz="2" w:space="0" w:color="CCCCCC"/>
               <w:left w:val="single" w:sz="2" w:space="0" w:color="CCCCCC"/>
@@ -18200,7 +18200,7 @@
         <w:trPr/>
         <w:tc>
           <w:tcPr>
-            <w:tcW w:w="2799" w:type="dxa"/>
+            <w:tcW w:w="2798" w:type="dxa"/>
             <w:tcBorders>
               <w:top w:val="single" w:sz="2" w:space="0" w:color="CCCCCC"/>
               <w:left w:val="single" w:sz="2" w:space="0" w:color="CCCCCC"/>
@@ -18229,7 +18229,7 @@
         </w:tc>
         <w:tc>
           <w:tcPr>
-            <w:tcW w:w="6226" w:type="dxa"/>
+            <w:tcW w:w="6227" w:type="dxa"/>
             <w:tcBorders>
               <w:top w:val="single" w:sz="2" w:space="0" w:color="CCCCCC"/>
               <w:left w:val="single" w:sz="2" w:space="0" w:color="CCCCCC"/>
@@ -18259,7 +18259,7 @@
         <w:trPr/>
         <w:tc>
           <w:tcPr>
-            <w:tcW w:w="2799" w:type="dxa"/>
+            <w:tcW w:w="2798" w:type="dxa"/>
             <w:tcBorders>
               <w:top w:val="single" w:sz="2" w:space="0" w:color="CCCCCC"/>
               <w:left w:val="single" w:sz="2" w:space="0" w:color="CCCCCC"/>
@@ -18288,7 +18288,7 @@
         </w:tc>
         <w:tc>
           <w:tcPr>
-            <w:tcW w:w="6226" w:type="dxa"/>
+            <w:tcW w:w="6227" w:type="dxa"/>
             <w:tcBorders>
               <w:top w:val="single" w:sz="2" w:space="0" w:color="CCCCCC"/>
               <w:left w:val="single" w:sz="2" w:space="0" w:color="CCCCCC"/>
@@ -18318,7 +18318,7 @@
         <w:trPr/>
         <w:tc>
           <w:tcPr>
-            <w:tcW w:w="2799" w:type="dxa"/>
+            <w:tcW w:w="2798" w:type="dxa"/>
             <w:tcBorders>
               <w:top w:val="single" w:sz="2" w:space="0" w:color="CCCCCC"/>
               <w:left w:val="single" w:sz="2" w:space="0" w:color="CCCCCC"/>
@@ -18347,7 +18347,7 @@
         </w:tc>
         <w:tc>
           <w:tcPr>
-            <w:tcW w:w="6226" w:type="dxa"/>
+            <w:tcW w:w="6227" w:type="dxa"/>
             <w:tcBorders>
               <w:top w:val="single" w:sz="2" w:space="0" w:color="CCCCCC"/>
               <w:left w:val="single" w:sz="2" w:space="0" w:color="CCCCCC"/>
@@ -18377,7 +18377,7 @@
         <w:trPr/>
         <w:tc>
           <w:tcPr>
-            <w:tcW w:w="2799" w:type="dxa"/>
+            <w:tcW w:w="2798" w:type="dxa"/>
             <w:tcBorders>
               <w:top w:val="single" w:sz="2" w:space="0" w:color="CCCCCC"/>
               <w:left w:val="single" w:sz="2" w:space="0" w:color="CCCCCC"/>
@@ -18406,7 +18406,7 @@
         </w:tc>
         <w:tc>
           <w:tcPr>
-            <w:tcW w:w="6226" w:type="dxa"/>
+            <w:tcW w:w="6227" w:type="dxa"/>
             <w:tcBorders>
               <w:top w:val="single" w:sz="2" w:space="0" w:color="CCCCCC"/>
               <w:left w:val="single" w:sz="2" w:space="0" w:color="CCCCCC"/>
@@ -18436,7 +18436,7 @@
         <w:trPr/>
         <w:tc>
           <w:tcPr>
-            <w:tcW w:w="2799" w:type="dxa"/>
+            <w:tcW w:w="2798" w:type="dxa"/>
             <w:tcBorders>
               <w:top w:val="single" w:sz="2" w:space="0" w:color="CCCCCC"/>
               <w:left w:val="single" w:sz="2" w:space="0" w:color="CCCCCC"/>
@@ -18465,7 +18465,7 @@
         </w:tc>
         <w:tc>
           <w:tcPr>
-            <w:tcW w:w="6226" w:type="dxa"/>
+            <w:tcW w:w="6227" w:type="dxa"/>
             <w:tcBorders>
               <w:top w:val="single" w:sz="2" w:space="0" w:color="CCCCCC"/>
               <w:left w:val="single" w:sz="2" w:space="0" w:color="CCCCCC"/>
@@ -18793,6 +18793,7 @@
         </w:tabs>
         <w:ind w:left="1440" w:hanging="360"/>
       </w:pPr>
+      <w:rPr/>
     </w:lvl>
     <w:lvl w:ilvl="3">
       <w:start w:val="1"/>
@@ -18805,6 +18806,7 @@
         </w:tabs>
         <w:ind w:left="1800" w:hanging="360"/>
       </w:pPr>
+      <w:rPr/>
     </w:lvl>
     <w:lvl w:ilvl="4">
       <w:start w:val="1"/>
@@ -18817,6 +18819,7 @@
         </w:tabs>
         <w:ind w:left="2160" w:hanging="360"/>
       </w:pPr>
+      <w:rPr/>
     </w:lvl>
     <w:lvl w:ilvl="5">
       <w:start w:val="1"/>
@@ -18829,6 +18832,7 @@
         </w:tabs>
         <w:ind w:left="2520" w:hanging="360"/>
       </w:pPr>
+      <w:rPr/>
     </w:lvl>
     <w:lvl w:ilvl="6">
       <w:start w:val="1"/>
@@ -18841,6 +18845,7 @@
         </w:tabs>
         <w:ind w:left="2880" w:hanging="360"/>
       </w:pPr>
+      <w:rPr/>
     </w:lvl>
     <w:lvl w:ilvl="7">
       <w:start w:val="1"/>
@@ -18853,6 +18858,7 @@
         </w:tabs>
         <w:ind w:left="3240" w:hanging="360"/>
       </w:pPr>
+      <w:rPr/>
     </w:lvl>
     <w:lvl w:ilvl="8">
       <w:start w:val="1"/>
@@ -18865,9 +18871,133 @@
         </w:tabs>
         <w:ind w:left="3600" w:hanging="360"/>
       </w:pPr>
+      <w:rPr/>
     </w:lvl>
   </w:abstractNum>
   <w:abstractNum w:abstractNumId="2">
+    <w:lvl w:ilvl="0">
+      <w:start w:val="1"/>
+      <w:numFmt w:val="bullet"/>
+      <w:lvlText w:val=""/>
+      <w:lvlJc w:val="left"/>
+      <w:pPr>
+        <w:tabs>
+          <w:tab w:val="num" w:pos="0"/>
+        </w:tabs>
+        <w:ind w:left="720" w:hanging="360"/>
+      </w:pPr>
+      <w:rPr>
+        <w:rFonts w:ascii="Symbol" w:hAnsi="Symbol" w:cs="Symbol" w:hint="default"/>
+      </w:rPr>
+    </w:lvl>
+    <w:lvl w:ilvl="1">
+      <w:start w:val="1"/>
+      <w:numFmt w:val="bullet"/>
+      <w:lvlText w:val="◦"/>
+      <w:lvlJc w:val="left"/>
+      <w:pPr>
+        <w:tabs>
+          <w:tab w:val="num" w:pos="0"/>
+        </w:tabs>
+        <w:ind w:left="1080" w:hanging="360"/>
+      </w:pPr>
+      <w:rPr>
+        <w:rFonts w:ascii="OpenSymbol" w:hAnsi="OpenSymbol" w:cs="OpenSymbol" w:hint="default"/>
+      </w:rPr>
+    </w:lvl>
+    <w:lvl w:ilvl="2">
+      <w:start w:val="1"/>
+      <w:numFmt w:val="decimal"/>
+      <w:lvlText w:val="%3."/>
+      <w:lvlJc w:val="left"/>
+      <w:pPr>
+        <w:tabs>
+          <w:tab w:val="num" w:pos="1440"/>
+        </w:tabs>
+        <w:ind w:left="1440" w:hanging="360"/>
+      </w:pPr>
+      <w:rPr/>
+    </w:lvl>
+    <w:lvl w:ilvl="3">
+      <w:start w:val="1"/>
+      <w:numFmt w:val="decimal"/>
+      <w:lvlText w:val="%4."/>
+      <w:lvlJc w:val="left"/>
+      <w:pPr>
+        <w:tabs>
+          <w:tab w:val="num" w:pos="1800"/>
+        </w:tabs>
+        <w:ind w:left="1800" w:hanging="360"/>
+      </w:pPr>
+      <w:rPr/>
+    </w:lvl>
+    <w:lvl w:ilvl="4">
+      <w:start w:val="1"/>
+      <w:numFmt w:val="decimal"/>
+      <w:lvlText w:val="%5."/>
+      <w:lvlJc w:val="left"/>
+      <w:pPr>
+        <w:tabs>
+          <w:tab w:val="num" w:pos="2160"/>
+        </w:tabs>
+        <w:ind w:left="2160" w:hanging="360"/>
+      </w:pPr>
+      <w:rPr/>
+    </w:lvl>
+    <w:lvl w:ilvl="5">
+      <w:start w:val="1"/>
+      <w:numFmt w:val="decimal"/>
+      <w:lvlText w:val="%6."/>
+      <w:lvlJc w:val="left"/>
+      <w:pPr>
+        <w:tabs>
+          <w:tab w:val="num" w:pos="2520"/>
+        </w:tabs>
+        <w:ind w:left="2520" w:hanging="360"/>
+      </w:pPr>
+      <w:rPr/>
+    </w:lvl>
+    <w:lvl w:ilvl="6">
+      <w:start w:val="1"/>
+      <w:numFmt w:val="decimal"/>
+      <w:lvlText w:val="%7."/>
+      <w:lvlJc w:val="left"/>
+      <w:pPr>
+        <w:tabs>
+          <w:tab w:val="num" w:pos="2880"/>
+        </w:tabs>
+        <w:ind w:left="2880" w:hanging="360"/>
+      </w:pPr>
+      <w:rPr/>
+    </w:lvl>
+    <w:lvl w:ilvl="7">
+      <w:start w:val="1"/>
+      <w:numFmt w:val="decimal"/>
+      <w:lvlText w:val="%8."/>
+      <w:lvlJc w:val="left"/>
+      <w:pPr>
+        <w:tabs>
+          <w:tab w:val="num" w:pos="3240"/>
+        </w:tabs>
+        <w:ind w:left="3240" w:hanging="360"/>
+      </w:pPr>
+      <w:rPr/>
+    </w:lvl>
+    <w:lvl w:ilvl="8">
+      <w:start w:val="1"/>
+      <w:numFmt w:val="decimal"/>
+      <w:lvlText w:val="%9."/>
+      <w:lvlJc w:val="left"/>
+      <w:pPr>
+        <w:tabs>
+          <w:tab w:val="num" w:pos="3600"/>
+        </w:tabs>
+        <w:ind w:left="3600" w:hanging="360"/>
+      </w:pPr>
+      <w:rPr/>
+    </w:lvl>
+  </w:abstractNum>
+  <w:abstractNum w:abstractNumId="3">
     <w:lvl w:ilvl="0">
       <w:start w:val="1"/>
       <w:numFmt w:val="none"/>
@@ -18993,10 +19123,394 @@
     <w:abstractNumId w:val="2"/>
   </w:num>
   <w:num w:numId="3">
-    <w:abstractNumId w:val="1"/>
+    <w:abstractNumId w:val="3"/>
+  </w:num>
+  <w:num w:numId="4">
+    <w:abstractNumId w:val="2"/>
     <w:lvlOverride w:ilvl="0">
       <w:startOverride w:val="1"/>
     </w:lvlOverride>
+  </w:num>
+  <w:num w:numId="5">
+    <w:abstractNumId w:val="2"/>
+  </w:num>
+  <w:num w:numId="6">
+    <w:abstractNumId w:val="2"/>
+  </w:num>
+  <w:num w:numId="7">
+    <w:abstractNumId w:val="2"/>
+  </w:num>
+  <w:num w:numId="8">
+    <w:abstractNumId w:val="2"/>
+  </w:num>
+  <w:num w:numId="9">
+    <w:abstractNumId w:val="2"/>
+  </w:num>
+  <w:num w:numId="10">
+    <w:abstractNumId w:val="2"/>
+  </w:num>
+  <w:num w:numId="11">
+    <w:abstractNumId w:val="2"/>
+  </w:num>
+  <w:num w:numId="12">
+    <w:abstractNumId w:val="2"/>
+  </w:num>
+  <w:num w:numId="13">
+    <w:abstractNumId w:val="2"/>
+  </w:num>
+  <w:num w:numId="14">
+    <w:abstractNumId w:val="2"/>
+  </w:num>
+  <w:num w:numId="15">
+    <w:abstractNumId w:val="2"/>
+  </w:num>
+  <w:num w:numId="16">
+    <w:abstractNumId w:val="2"/>
+  </w:num>
+  <w:num w:numId="17">
+    <w:abstractNumId w:val="2"/>
+  </w:num>
+  <w:num w:numId="18">
+    <w:abstractNumId w:val="2"/>
+  </w:num>
+  <w:num w:numId="19">
+    <w:abstractNumId w:val="2"/>
+  </w:num>
+  <w:num w:numId="20">
+    <w:abstractNumId w:val="2"/>
+  </w:num>
+  <w:num w:numId="21">
+    <w:abstractNumId w:val="2"/>
+  </w:num>
+  <w:num w:numId="22">
+    <w:abstractNumId w:val="2"/>
+  </w:num>
+  <w:num w:numId="23">
+    <w:abstractNumId w:val="2"/>
+  </w:num>
+  <w:num w:numId="24">
+    <w:abstractNumId w:val="2"/>
+  </w:num>
+  <w:num w:numId="25">
+    <w:abstractNumId w:val="2"/>
+  </w:num>
+  <w:num w:numId="26">
+    <w:abstractNumId w:val="2"/>
+  </w:num>
+  <w:num w:numId="27">
+    <w:abstractNumId w:val="2"/>
+  </w:num>
+  <w:num w:numId="28">
+    <w:abstractNumId w:val="2"/>
+  </w:num>
+  <w:num w:numId="29">
+    <w:abstractNumId w:val="2"/>
+  </w:num>
+  <w:num w:numId="30">
+    <w:abstractNumId w:val="2"/>
+  </w:num>
+  <w:num w:numId="31">
+    <w:abstractNumId w:val="2"/>
+  </w:num>
+  <w:num w:numId="32">
+    <w:abstractNumId w:val="2"/>
+  </w:num>
+  <w:num w:numId="33">
+    <w:abstractNumId w:val="2"/>
+  </w:num>
+  <w:num w:numId="34">
+    <w:abstractNumId w:val="2"/>
+  </w:num>
+  <w:num w:numId="35">
+    <w:abstractNumId w:val="2"/>
+  </w:num>
+  <w:num w:numId="36">
+    <w:abstractNumId w:val="2"/>
+  </w:num>
+  <w:num w:numId="37">
+    <w:abstractNumId w:val="2"/>
+  </w:num>
+  <w:num w:numId="38">
+    <w:abstractNumId w:val="2"/>
+  </w:num>
+  <w:num w:numId="39">
+    <w:abstractNumId w:val="2"/>
+  </w:num>
+  <w:num w:numId="40">
+    <w:abstractNumId w:val="2"/>
+  </w:num>
+  <w:num w:numId="41">
+    <w:abstractNumId w:val="2"/>
+  </w:num>
+  <w:num w:numId="42">
+    <w:abstractNumId w:val="2"/>
+  </w:num>
+  <w:num w:numId="43">
+    <w:abstractNumId w:val="2"/>
+  </w:num>
+  <w:num w:numId="44">
+    <w:abstractNumId w:val="2"/>
+  </w:num>
+  <w:num w:numId="45">
+    <w:abstractNumId w:val="2"/>
+  </w:num>
+  <w:num w:numId="46">
+    <w:abstractNumId w:val="2"/>
+  </w:num>
+  <w:num w:numId="47">
+    <w:abstractNumId w:val="2"/>
+  </w:num>
+  <w:num w:numId="48">
+    <w:abstractNumId w:val="2"/>
+  </w:num>
+  <w:num w:numId="49">
+    <w:abstractNumId w:val="2"/>
+  </w:num>
+  <w:num w:numId="50">
+    <w:abstractNumId w:val="2"/>
+  </w:num>
+  <w:num w:numId="51">
+    <w:abstractNumId w:val="2"/>
+  </w:num>
+  <w:num w:numId="52">
+    <w:abstractNumId w:val="2"/>
+  </w:num>
+  <w:num w:numId="53">
+    <w:abstractNumId w:val="2"/>
+  </w:num>
+  <w:num w:numId="54">
+    <w:abstractNumId w:val="2"/>
+  </w:num>
+  <w:num w:numId="55">
+    <w:abstractNumId w:val="2"/>
+  </w:num>
+  <w:num w:numId="56">
+    <w:abstractNumId w:val="2"/>
+  </w:num>
+  <w:num w:numId="57">
+    <w:abstractNumId w:val="2"/>
+  </w:num>
+  <w:num w:numId="58">
+    <w:abstractNumId w:val="2"/>
+  </w:num>
+  <w:num w:numId="59">
+    <w:abstractNumId w:val="2"/>
+  </w:num>
+  <w:num w:numId="60">
+    <w:abstractNumId w:val="2"/>
+  </w:num>
+  <w:num w:numId="61">
+    <w:abstractNumId w:val="2"/>
+  </w:num>
+  <w:num w:numId="62">
+    <w:abstractNumId w:val="2"/>
+  </w:num>
+  <w:num w:numId="63">
+    <w:abstractNumId w:val="2"/>
+  </w:num>
+  <w:num w:numId="64">
+    <w:abstractNumId w:val="2"/>
+  </w:num>
+  <w:num w:numId="65">
+    <w:abstractNumId w:val="2"/>
+  </w:num>
+  <w:num w:numId="66">
+    <w:abstractNumId w:val="2"/>
+  </w:num>
+  <w:num w:numId="67">
+    <w:abstractNumId w:val="2"/>
+  </w:num>
+  <w:num w:numId="68">
+    <w:abstractNumId w:val="2"/>
+  </w:num>
+  <w:num w:numId="69">
+    <w:abstractNumId w:val="2"/>
+  </w:num>
+  <w:num w:numId="70">
+    <w:abstractNumId w:val="2"/>
+  </w:num>
+  <w:num w:numId="71">
+    <w:abstractNumId w:val="2"/>
+  </w:num>
+  <w:num w:numId="72">
+    <w:abstractNumId w:val="2"/>
+  </w:num>
+  <w:num w:numId="73">
+    <w:abstractNumId w:val="2"/>
+  </w:num>
+  <w:num w:numId="74">
+    <w:abstractNumId w:val="2"/>
+  </w:num>
+  <w:num w:numId="75">
+    <w:abstractNumId w:val="2"/>
+  </w:num>
+  <w:num w:numId="76">
+    <w:abstractNumId w:val="2"/>
+  </w:num>
+  <w:num w:numId="77">
+    <w:abstractNumId w:val="2"/>
+  </w:num>
+  <w:num w:numId="78">
+    <w:abstractNumId w:val="2"/>
+  </w:num>
+  <w:num w:numId="79">
+    <w:abstractNumId w:val="2"/>
+  </w:num>
+  <w:num w:numId="80">
+    <w:abstractNumId w:val="2"/>
+  </w:num>
+  <w:num w:numId="81">
+    <w:abstractNumId w:val="2"/>
+  </w:num>
+  <w:num w:numId="82">
+    <w:abstractNumId w:val="2"/>
+  </w:num>
+  <w:num w:numId="83">
+    <w:abstractNumId w:val="2"/>
+  </w:num>
+  <w:num w:numId="84">
+    <w:abstractNumId w:val="2"/>
+  </w:num>
+  <w:num w:numId="85">
+    <w:abstractNumId w:val="2"/>
+  </w:num>
+  <w:num w:numId="86">
+    <w:abstractNumId w:val="2"/>
+  </w:num>
+  <w:num w:numId="87">
+    <w:abstractNumId w:val="2"/>
+  </w:num>
+  <w:num w:numId="88">
+    <w:abstractNumId w:val="2"/>
+  </w:num>
+  <w:num w:numId="89">
+    <w:abstractNumId w:val="2"/>
+  </w:num>
+  <w:num w:numId="90">
+    <w:abstractNumId w:val="2"/>
+  </w:num>
+  <w:num w:numId="91">
+    <w:abstractNumId w:val="2"/>
+  </w:num>
+  <w:num w:numId="92">
+    <w:abstractNumId w:val="2"/>
+  </w:num>
+  <w:num w:numId="93">
+    <w:abstractNumId w:val="2"/>
+  </w:num>
+  <w:num w:numId="94">
+    <w:abstractNumId w:val="2"/>
+  </w:num>
+  <w:num w:numId="95">
+    <w:abstractNumId w:val="2"/>
+  </w:num>
+  <w:num w:numId="96">
+    <w:abstractNumId w:val="2"/>
+  </w:num>
+  <w:num w:numId="97">
+    <w:abstractNumId w:val="2"/>
+  </w:num>
+  <w:num w:numId="98">
+    <w:abstractNumId w:val="2"/>
+  </w:num>
+  <w:num w:numId="99">
+    <w:abstractNumId w:val="2"/>
+  </w:num>
+  <w:num w:numId="100">
+    <w:abstractNumId w:val="2"/>
+  </w:num>
+  <w:num w:numId="101">
+    <w:abstractNumId w:val="2"/>
+  </w:num>
+  <w:num w:numId="102">
+    <w:abstractNumId w:val="2"/>
+  </w:num>
+  <w:num w:numId="103">
+    <w:abstractNumId w:val="2"/>
+  </w:num>
+  <w:num w:numId="104">
+    <w:abstractNumId w:val="2"/>
+  </w:num>
+  <w:num w:numId="105">
+    <w:abstractNumId w:val="2"/>
+  </w:num>
+  <w:num w:numId="106">
+    <w:abstractNumId w:val="2"/>
+  </w:num>
+  <w:num w:numId="107">
+    <w:abstractNumId w:val="2"/>
+  </w:num>
+  <w:num w:numId="108">
+    <w:abstractNumId w:val="2"/>
+  </w:num>
+  <w:num w:numId="109">
+    <w:abstractNumId w:val="2"/>
+  </w:num>
+  <w:num w:numId="110">
+    <w:abstractNumId w:val="2"/>
+  </w:num>
+  <w:num w:numId="111">
+    <w:abstractNumId w:val="2"/>
+  </w:num>
+  <w:num w:numId="112">
+    <w:abstractNumId w:val="2"/>
+  </w:num>
+  <w:num w:numId="113">
+    <w:abstractNumId w:val="2"/>
+  </w:num>
+  <w:num w:numId="114">
+    <w:abstractNumId w:val="2"/>
+  </w:num>
+  <w:num w:numId="115">
+    <w:abstractNumId w:val="2"/>
+  </w:num>
+  <w:num w:numId="116">
+    <w:abstractNumId w:val="2"/>
+  </w:num>
+  <w:num w:numId="117">
+    <w:abstractNumId w:val="2"/>
+  </w:num>
+  <w:num w:numId="118">
+    <w:abstractNumId w:val="2"/>
+  </w:num>
+  <w:num w:numId="119">
+    <w:abstractNumId w:val="2"/>
+  </w:num>
+  <w:num w:numId="120">
+    <w:abstractNumId w:val="2"/>
+  </w:num>
+  <w:num w:numId="121">
+    <w:abstractNumId w:val="2"/>
+  </w:num>
+  <w:num w:numId="122">
+    <w:abstractNumId w:val="2"/>
+  </w:num>
+  <w:num w:numId="123">
+    <w:abstractNumId w:val="2"/>
+  </w:num>
+  <w:num w:numId="124">
+    <w:abstractNumId w:val="2"/>
+  </w:num>
+  <w:num w:numId="125">
+    <w:abstractNumId w:val="2"/>
+  </w:num>
+  <w:num w:numId="126">
+    <w:abstractNumId w:val="2"/>
+  </w:num>
+  <w:num w:numId="127">
+    <w:abstractNumId w:val="2"/>
+  </w:num>
+  <w:num w:numId="128">
+    <w:abstractNumId w:val="2"/>
+  </w:num>
+  <w:num w:numId="129">
+    <w:abstractNumId w:val="2"/>
+  </w:num>
+  <w:num w:numId="130">
+    <w:abstractNumId w:val="2"/>
+  </w:num>
+  <w:num w:numId="131">
+    <w:abstractNumId w:val="2"/>
   </w:num>
 </w:numbering>
 </file>
@@ -19023,6 +19537,7 @@
     <w:qFormat/>
     <w:pPr>
       <w:widowControl/>
+      <w:suppressAutoHyphens w:val="true"/>
       <w:bidi w:val="0"/>
       <w:spacing w:before="0" w:after="0"/>
       <w:jc w:val="left"/>
@@ -19252,6 +19767,7 @@
     <w:qFormat/>
     <w:pPr>
       <w:widowControl/>
+      <w:suppressAutoHyphens w:val="true"/>
       <w:bidi w:val="0"/>
       <w:spacing w:before="0" w:after="0"/>
       <w:jc w:val="left"/>
@@ -19272,6 +19788,7 @@
     <w:qFormat/>
     <w:pPr>
       <w:widowControl/>
+      <w:suppressAutoHyphens w:val="true"/>
       <w:bidi w:val="0"/>
       <w:spacing w:before="0" w:after="0"/>
       <w:jc w:val="left"/>

</xml_diff>